<commit_message>
feat: add auto-cv surrogate triage artifacts
</commit_message>
<xml_diff>
--- a/docs/manuscript.docx
+++ b/docs/manuscript.docx
@@ -37,7 +37,7 @@
         <w:pStyle w:val="FirstParagraph"/>
       </w:pPr>
       <w:r>
-        <w:t xml:space="preserve">Solubility-aware protein redesign increasingly depends on heterogeneous AI models for sequence search, conservation analysis, backbone or conformational sampling, inverse folding, soluble-expression filtering, structure prediction, and novelty assessment. These components are powerful individually, but practical campaigns often connect them with ad hoc scripts, making runs difficult to reproduce, rerun, compare, or update when a model backend changes. We present RAPID, a reproducible artifact pipeline for integrated design that turns fragmented model outputs into a stage-aware, run-scoped experimental substrate for solubility-aware multiple-mutant redesign. RAPID preserves typed requests, intermediate artifacts, status histories, orchestration traces, experiment records, quality-control records, and final summaries under stable run identifiers, allowing downstream analyses to be regenerated from stored artifacts rather than from repeated live model calls. We use RAPID to support three claims. First, an artifact contract and local/static interface make model replacement and retrospective analysis operational rather than manual. Second, an AF2-budgeted surrogate triage mode reduces structure-prediction use after SoluProt gating by using ESM-2 embeddings, K-means bootstrap selection, local surrogate ranking, and Top-K acquisition; in the current artifact benchmark, K-means gives its largest advantage in the small-label regime, Random Forest is the conservative default for pLDDT-oriented triage, and the implemented default evaluates 30 bootstrap candidates plus 20 surrogate-ranked Top-K candidates when the SoluProt-passing pool exceeds this budget. Third, target-level variation dominates observed design-quality variation, motivating explicit tests of compute allocation across single-target, BioEmu, RFD3, and RFD3+BioEmu structural contexts rather than simply increasing sequence sampling around one backbone. RAPID also exposes an experimental-feedback evolution mode that writes candidate sets for wet-lab testing and can train the next surrogate from user-supplied objective values. The present evidence is computational and proxy-based: pLDDT, SoluProt, and relax scores do not establish wet-lab soluble expression, thermodynamic stability, or activity. RAPID is therefore positioned as reproducible infrastructure for solubility-aware redesign and compute allocation, with final biological validation left to experimental follow-up.</w:t>
+        <w:t xml:space="preserve">Solubility-aware protein redesign increasingly depends on heterogeneous AI models for sequence search, conservation analysis, backbone or conformational sampling, inverse folding, soluble-expression filtering, structure prediction, and novelty assessment. These components are powerful individually, but practical campaigns often connect them with ad hoc scripts, making runs difficult to reproduce, rerun, compare, or update when a model backend changes. We present RAPID, a reproducible artifact pipeline for integrated design that turns fragmented model outputs into a stage-aware, run-scoped experimental substrate for solubility-aware multiple-mutant redesign. RAPID preserves typed requests, intermediate artifacts, status histories, orchestration traces, experiment records, quality-control records, and final summaries under stable run identifiers, allowing downstream analyses to be regenerated from stored artifacts rather than from repeated live model calls. We use RAPID to support three claims. First, an artifact contract and local/static interface make model replacement and retrospective analysis operational rather than manual. Second, an AF2-budgeted surrogate triage mode reduces structure-prediction use after SoluProt gating by using ESM-2 embeddings, K-means bootstrap selection, internal cross-validation of local surrogate policies, and Top-K acquisition; in the current artifact benchmark, K-means gives its largest advantage in the small-label regime, Random Forest is a conservative pLDDT-oriented policy, and the implemented default evaluates 30 bootstrap candidates plus 20 Top-K candidates selected by the best internally cross-validated acquisition policy when the SoluProt-passing pool exceeds this budget. Third, target-level variation dominates observed design-quality variation, motivating explicit tests of compute allocation across single-target, BioEmu, RFD3, and RFD3+BioEmu structural contexts rather than simply increasing sequence sampling around one backbone. RAPID also exposes an experimental-feedback evolution mode that writes candidate sets for wet-lab testing and can train the next surrogate from user-supplied objective values. The present evidence is computational and proxy-based: pLDDT, SoluProt, and relax scores do not establish wet-lab soluble expression, thermodynamic stability, or activity. RAPID is therefore positioned as reproducible infrastructure for solubility-aware redesign and compute allocation, with final biological validation left to experimental follow-up.</w:t>
       </w:r>
     </w:p>
     <w:bookmarkEnd w:id="20"/>
@@ -621,15 +621,15 @@
         <w:pStyle w:val="FirstParagraph"/>
       </w:pPr>
       <w:r>
-        <w:t xml:space="preserve">RAPID separates two related uses of surrogates. The first is a computational AF2-budgeted triage mode used in the benchmark (Figure 2). ProteinMPNN first generates a candidate pool across conservation tiers, and SoluProt scores every candidate. SoluProt-passing candidates are embedded with mean-pooled ESM-2 8M embeddings [4]. K-means selects a diverse bootstrap training set, AF2 labels those candidates, and a local surrogate is trained to rank the remaining SoluProt-passing pool by predicted pLDDT. AF2 then evaluates only the surrogate-ranked Top-K candidates. This mode is a compute-allocation policy for structure prediction, not evidence of experimental activity or expression.</w:t>
-      </w:r>
-    </w:p>
-    <w:p>
-      <w:pPr>
-        <w:pStyle w:val="BodyText"/>
-      </w:pPr>
-      <w:r>
-        <w:t xml:space="preserve">The production triage default uses 30 K-means-selected bootstrap labels and 20 Top-K AF2 acquisitions. The N = 30 bootstrap was chosen because the sample-size ablation reaches most of the observed Random Forest pLDDT uplift by that point, while Top-K = 20 fixes a target-level validation budget that is large enough for manual review but small enough to keep the AF2 cost explicit. The benchmark evaluates Random Forest, Ridge, GP-RBF, XGBoost, LightGBM, KNN, MLP, and random selection, with Random Forest and Ridge retained as the primary production options because they represent different score-specific operating points. The implemented interface also permits several surrogate models to be selected together; in that case they share the same AF2-labelled bootstrap set and use rank-mean acquisition, so model robustness can be tested without multiplying AF2 calls.</w:t>
+        <w:t xml:space="preserve">RAPID separates two related uses of surrogates. The first is a computational AF2-budgeted triage mode used in the benchmark (Figure 2). ProteinMPNN first generates a candidate pool across conservation tiers, and SoluProt scores every candidate. SoluProt-passing candidates are embedded with mean-pooled ESM-2 8M embeddings [4]. K-means selects a diverse bootstrap training set, AF2 labels those candidates, and local surrogate policies are compared by internal cross-validation on the labelled set. The selected acquisition policy is then refit on all bootstrap labels and used to rank the remaining SoluProt-passing pool. AF2 evaluates only the selected policy’s Top-K candidates. This mode is a compute-allocation policy for structure prediction, not evidence of experimental activity or expression.</w:t>
+      </w:r>
+    </w:p>
+    <w:p>
+      <w:pPr>
+        <w:pStyle w:val="BodyText"/>
+      </w:pPr>
+      <w:r>
+        <w:t xml:space="preserve">The production triage default uses 30 K-means-selected bootstrap labels and 20 Top-K AF2 acquisitions. The N = 30 bootstrap was chosen because the sample-size ablation reaches most of the observed Random Forest pLDDT uplift by that point, while Top-K = 20 fixes a target-level validation budget that is large enough for manual review but small enough to keep the AF2 cost explicit. RAPID trains comparator policies on the same labelled bootstrap set, writes cross-validation metrics, a model-comparison SVG, candidate-level predictions, Top-K overlap summaries, feature-importance or coefficient tables, and fitted model files, and then uses only one selected acquisition policy for the final Top-K. Thus model comparison is recorded without multiplying AF2 calls. Manual override remains available for controlled runs using Random Forest, Ridge, XGBoost, LightGBM, or rank-mean ensemble.</w:t>
       </w:r>
     </w:p>
     <w:p>
@@ -769,7 +769,7 @@
           <w:iCs/>
           <w:i/>
         </w:rPr>
-        <w:t xml:space="preserve">Figure 2. AF2-budgeted surrogate triage. K-means selects a diverse AF2-labelled bootstrap set from SoluProt-passing candidates, one or more local surrogates rank the remaining pool, and AF2/ColabFold is reserved for Top-K acquisitions. When several surrogate families are selected, RAPID averages their held-out rank orders and still evaluates the same Top-K budget. Experimental-feedback evolution uses the same candidate and embedding contract but learns from user-recorded wet-lab objective values rather than treating AF2 as a biological oracle.</w:t>
+        <w:t xml:space="preserve">Figure 2. AF2-budgeted surrogate triage. K-means selects a diverse AF2-labelled bootstrap set from SoluProt-passing candidates. RAPID compares local surrogate policies by internal cross-validation, refits the selected policy on all bootstrap labels, and reserves AF2/ColabFold for one Top-K acquisition set. Comparator models, rank-mean ensemble, feature summaries, fitted model files, and prediction tables are exported as artifacts without expanding the AF2 budget. Experimental-feedback evolution uses the same candidate and embedding contract but learns from user-recorded wet-lab objective values rather than treating AF2 as a biological oracle.</w:t>
       </w:r>
     </w:p>
     <w:bookmarkEnd w:id="31"/>
@@ -1422,7 +1422,7 @@
         <w:pStyle w:val="BodyText"/>
       </w:pPr>
       <w:r>
-        <w:t xml:space="preserve">At the N = 30 operating point, Random Forest gives the highest mean pLDDT BO uplift Top-5 in the current artifact benchmark, while Ridge is strongest for SoluProt ranking and recall-oriented metrics. Because SoluProt is directly scored for every candidate in RAPID, the primary surrogate bottleneck is pLDDT-oriented AF2 triage. RAPID therefore uses Random Forest as the conservative default for pLDDT-driven acquisition and retains Ridge as an option when SoluProt ranking or recall is prioritised.</w:t>
+        <w:t xml:space="preserve">At the N = 30 operating point, Random Forest gives the highest mean pLDDT BO uplift Top-5 in the current artifact benchmark, while Ridge is strongest for SoluProt ranking and recall-oriented metrics. Because the best policy can vary by target and score emphasis, RAPID’s implemented default is not a hard-coded Random Forest choice. Instead, RAPID compares the configured surrogate policies on the initial AF2-labelled bootstrap set and uses the strongest internally cross-validated policy for Top-K acquisition. Random Forest remains the conservative pLDDT-oriented reference policy in the artifact benchmark, and Ridge remains available when SoluProt-oriented ranking or recall is prioritised.</w:t>
       </w:r>
     </w:p>
     <w:p>
@@ -1489,7 +1489,7 @@
           <w:iCs/>
           <w:i/>
         </w:rPr>
-        <w:t xml:space="preserve">Figure 3. Current artifact-benchmark surrogate comparison at N = 30. Random Forest is the conservative pLDDT BO-uplift default, whereas Ridge dominates SoluProt-related ranking metrics. Detailed model tables and per-target heatmaps are reported in the supplement.</w:t>
+        <w:t xml:space="preserve">Figure 3. Current artifact-benchmark surrogate comparison at N = 30. Random Forest is the conservative pLDDT BO-uplift reference, whereas Ridge dominates SoluProt-related ranking metrics. RAPID uses these benchmark results to define comparator policies and then selects the acquisition policy within each run by internal CV. Detailed model tables and per-target heatmaps are reported in the supplement.</w:t>
       </w:r>
     </w:p>
     <w:tbl>
@@ -1654,7 +1654,7 @@
               <w:jc w:val="left"/>
             </w:pPr>
             <w:r>
-              <w:t xml:space="preserve">RF is the conservative AF2-triage default</w:t>
+              <w:t xml:space="preserve">RF is the conservative AF2-triage reference policy</w:t>
             </w:r>
           </w:p>
         </w:tc>
@@ -1982,7 +1982,7 @@
           <w:iCs/>
           <w:i/>
         </w:rPr>
-        <w:t xml:space="preserve">Table 5. AF2 budget model for the standard surrogate-triage mode. The implemented default evaluates 30 K-means bootstrap candidates and 20 Top-K acquisitions. This table is a budget model, not a biological enrichment result; prospective wet-lab outcomes are handled by the separate experimental-feedback evolution mode.</w:t>
+        <w:t xml:space="preserve">Table 5. AF2 budget model for the standard surrogate-triage mode. The implemented default evaluates 30 K-means bootstrap candidates and 20 Top-K acquisitions selected by one internally cross-validated acquisition policy. Comparator models are trained and exported for audit, but they do not add AF2 calls unless the operator explicitly changes the validation budget. This table is a budget model, not a biological enrichment result; prospective wet-lab outcomes are handled by the separate experimental-feedback evolution mode.</w:t>
       </w:r>
     </w:p>
     <w:p>
@@ -2642,7 +2642,7 @@
         <w:pStyle w:val="BodyText"/>
       </w:pPr>
       <w:r>
-        <w:t xml:space="preserve">The surrogate-triage result is similarly bounded. The evidence supports an AF2-allocation policy, not a wet-lab hit-rate claim. K-means is most useful as a cold-start diversity mechanism, Random Forest is a conservative pLDDT acquisition default, Ridge is useful for SoluProt-oriented ranking, and N = 30 is a cost-efficient bootstrap point in the current artifact benchmark. These findings justify the implemented budget model because they directly address the expensive AF2 step after SoluProt filtering. The experimental-feedback evolution mode extends the same artifact substrate into a design-test-learn workflow by accepting objective metric values from assay records, but its biological utility must be assessed prospectively.</w:t>
+        <w:t xml:space="preserve">The surrogate-triage result is similarly bounded. The evidence supports an AF2-allocation policy, not a wet-lab hit-rate claim. K-means is most useful as a cold-start diversity mechanism, Random Forest is a conservative pLDDT acquisition reference, Ridge is useful for SoluProt-oriented ranking, and N = 30 is a cost-efficient bootstrap point in the current artifact benchmark. The current implementation uses those observations to define comparator policies, then selects one acquisition policy by internal CV for each run. These findings justify the implemented budget model because they directly address the expensive AF2 step after SoluProt filtering. The experimental-feedback evolution mode extends the same artifact substrate into a design-test-learn workflow by accepting objective metric values from assay records, but its biological utility must be assessed prospectively.</w:t>
       </w:r>
     </w:p>
     <w:p>
@@ -2694,7 +2694,7 @@
         <w:pStyle w:val="FirstParagraph"/>
       </w:pPr>
       <w:r>
-        <w:t xml:space="preserve">RAPID addresses a practical gap between rapidly changing protein-design models and the reproducible infrastructure needed to use them in solubility-aware redesign campaigns. It preserves run-scoped artifacts, supports controlled partial reruns, exposes the workflow through a packageable static interface and backend API, and keeps model interfaces replaceable. On top of this infrastructure, an AF2-budgeted surrogate-triage mode uses SoluProt gating, K-means bootstrap selection, local surrogate ranking, and Top-K acquisition to reduce structure-prediction calls. A separate experimental-feedback evolution mode records assay outcomes and uses those labels to recommend the next candidate set.</w:t>
+        <w:t xml:space="preserve">RAPID addresses a practical gap between rapidly changing protein-design models and the reproducible infrastructure needed to use them in solubility-aware redesign campaigns. It preserves run-scoped artifacts, supports controlled partial reruns, exposes the workflow through a packageable static interface and backend API, and keeps model interfaces replaceable. On top of this infrastructure, an AF2-budgeted surrogate-triage mode uses SoluProt gating, K-means bootstrap selection, internal CV-based acquisition-policy selection, and Top-K acquisition to reduce structure-prediction calls while exporting comparator-model evidence for audit. A separate experimental-feedback evolution mode records assay outcomes and uses those labels to recommend the next candidate set.</w:t>
       </w:r>
     </w:p>
     <w:p>

</xml_diff>

<commit_message>
chore: refresh structural context results and auto-cv paper run
</commit_message>
<xml_diff>
--- a/docs/manuscript.docx
+++ b/docs/manuscript.docx
@@ -1039,7 +1039,7 @@
         <w:pStyle w:val="BodyText"/>
       </w:pPr>
       <w:r>
-        <w:t xml:space="preserve">The present structural-context analysis includes a three-target RFD3 pilot comparing a single target backbone, one selected RFD3 backbone, and a three-backbone RFD3 ensemble. This pilot is retained as preliminary evidence that structural context changes target-dependent outcomes. A corrected-chain four-arm RAPID ablation protocol has also been implemented for the expanded data refresh, using the target manifest generated from corrected-chain CATH inputs. For the BioEmu arms in that refresh, the primary analysis keeps the same 2.0 Å target-RMSD gate across targets; sensitivity reruns may increase the sampling budget, but not the acceptance cutoff.</w:t>
+        <w:t xml:space="preserve">The present structural-context analysis uses a corrected-chain eight-target RAPID ablation. The single-backbone and RFD3 arms are evaluable for all eight targets, whereas BioEmu-containing arms are evaluable for four targets under the 2.0 Å target-RMSD gate. This partial evaluability is treated as a workflow QC outcome rather than as a failed design score. For BioEmu sensitivity analyses, sampling budgets may be increased, but the acceptance cutoff is kept fixed to avoid post-hoc relaxation of the structural-quality criterion.</w:t>
       </w:r>
     </w:p>
     <w:bookmarkEnd w:id="33"/>
@@ -2262,7 +2262,7 @@
         <w:pStyle w:val="BodyText"/>
       </w:pPr>
       <w:r>
-        <w:t xml:space="preserve">The completed three-target RFD3 pilot is consistent with this interpretation but is not powered as a general performance claim. Averaged over three CATH targets, the selected-RFD3 arm had higher Top-5 pLDDT than the single-backbone arm, whereas the RFD3-ensemble arm was intermediate for pLDDT and slightly higher for Top-5 SoluProt. The target-level pattern was mixed: RFD3 helped a low-pLDDT case but did not uniformly improve already high-confidence targets. This supports the claim that structural-context exploration is measurable and target-dependent, not the claim that one structural generator is universally superior.</w:t>
+        <w:t xml:space="preserve">The corrected-chain structural-context ablation is consistent with this interpretation but does not support a universal generator ranking. Under matched budgets, each evaluable target-arm produced 120 ProteinMPNN designs and 30 AF2/ColabFold records. Across all eight targets, the single-backbone and selected-RFD3 arms had nearly identical mean Top-5 pLDDT values (92.58 and 92.53, respectively), with mixed target-level deltas. Among the four targets for which BioEmu-containing arms passed the RMSD gate, BioEmu increased Top-5 SoluProt modestly relative to the corresponding single-backbone runs (+0.024 on average) and reduced pairwise sequence identity (-0.105), but did not improve paired Top-5 pLDDT. These results support the claim that structural context is a measurable allocation variable, not the claim that RFD3, BioEmu, or their combination is universally superior.</w:t>
       </w:r>
     </w:p>
     <w:p>
@@ -2272,9 +2272,9 @@
       <w:r>
         <w:drawing>
           <wp:inline>
-            <wp:extent cx="5334000" cy="1668473"/>
+            <wp:extent cx="5334000" cy="1664050"/>
             <wp:effectExtent b="0" l="0" r="0" t="0"/>
-            <wp:docPr descr="Structural-context pilot" title="" id="44" name="Picture"/>
+            <wp:docPr descr="Structural-context ablation" title="" id="44" name="Picture"/>
             <a:graphic>
               <a:graphicData uri="http://schemas.openxmlformats.org/drawingml/2006/picture">
                 <pic:pic>
@@ -2293,7 +2293,7 @@
                   <pic:spPr bwMode="auto">
                     <a:xfrm>
                       <a:off x="0" y="0"/>
-                      <a:ext cx="5334000" cy="1668473"/>
+                      <a:ext cx="5334000" cy="1664050"/>
                     </a:xfrm>
                     <a:prstGeom prst="rect">
                       <a:avLst/>
@@ -2317,7 +2317,7 @@
         <w:pStyle w:val="ImageCaption"/>
       </w:pPr>
       <w:r>
-        <w:t xml:space="preserve">Structural-context pilot</w:t>
+        <w:t xml:space="preserve">Structural-context ablation</w:t>
       </w:r>
     </w:p>
     <w:p>
@@ -2329,7 +2329,7 @@
           <w:iCs/>
           <w:i/>
         </w:rPr>
-        <w:t xml:space="preserve">Figure 5. Three-target structural-context pilot. The single-target, selected-RFD3, and RFD3-ensemble arms were compared under matched AF2 caps. The updated RAPID implementation extends this protocol to BioEmu and RFD3+BioEmu arms for the corrected-chain data refresh.</w:t>
+        <w:t xml:space="preserve">Figure 5. Corrected-chain structural-context ablation. Single-backbone and RFD3 arms are evaluable for eight targets, while BioEmu and RFD3+BioEmu are evaluable for the four targets that passed the pre-specified 2.0 Å target-RMSD gate. The figure is interpreted as an allocation and QC analysis, not as evidence for a universal structural-generator advantage.</w:t>
       </w:r>
     </w:p>
     <w:tbl>
@@ -2456,19 +2456,19 @@
               <w:jc w:val="right"/>
             </w:pPr>
             <w:r>
-              <w:t xml:space="preserve">84.76</w:t>
-            </w:r>
-          </w:p>
-        </w:tc>
-        <w:tc>
-          <w:tcPr/>
-          <w:p>
-            <w:pPr>
-              <w:pStyle w:val="Compact"/>
-              <w:jc w:val="right"/>
-            </w:pPr>
-            <w:r>
-              <w:t xml:space="preserve">0.756</w:t>
+              <w:t xml:space="preserve">92.58</w:t>
+            </w:r>
+          </w:p>
+        </w:tc>
+        <w:tc>
+          <w:tcPr/>
+          <w:p>
+            <w:pPr>
+              <w:pStyle w:val="Compact"/>
+              <w:jc w:val="right"/>
+            </w:pPr>
+            <w:r>
+              <w:t xml:space="preserve">0.718</w:t>
             </w:r>
           </w:p>
         </w:tc>
@@ -2482,7 +2482,7 @@
               <w:jc w:val="left"/>
             </w:pPr>
             <w:r>
-              <w:t xml:space="preserve">RFD3 selected backbone</w:t>
+              <w:t xml:space="preserve">Target + BioEmu ensemble</w:t>
             </w:r>
           </w:p>
         </w:tc>
@@ -2518,19 +2518,19 @@
               <w:jc w:val="right"/>
             </w:pPr>
             <w:r>
-              <w:t xml:space="preserve">87.58</w:t>
-            </w:r>
-          </w:p>
-        </w:tc>
-        <w:tc>
-          <w:tcPr/>
-          <w:p>
-            <w:pPr>
-              <w:pStyle w:val="Compact"/>
-              <w:jc w:val="right"/>
-            </w:pPr>
-            <w:r>
-              <w:t xml:space="preserve">0.725</w:t>
+              <w:t xml:space="preserve">96.28</w:t>
+            </w:r>
+          </w:p>
+        </w:tc>
+        <w:tc>
+          <w:tcPr/>
+          <w:p>
+            <w:pPr>
+              <w:pStyle w:val="Compact"/>
+              <w:jc w:val="right"/>
+            </w:pPr>
+            <w:r>
+              <w:t xml:space="preserve">0.788</w:t>
             </w:r>
           </w:p>
         </w:tc>
@@ -2544,19 +2544,19 @@
               <w:jc w:val="left"/>
             </w:pPr>
             <w:r>
-              <w:t xml:space="preserve">RFD3 ensemble, 3 backbones</w:t>
-            </w:r>
-          </w:p>
-        </w:tc>
-        <w:tc>
-          <w:tcPr/>
-          <w:p>
-            <w:pPr>
-              <w:pStyle w:val="Compact"/>
-              <w:jc w:val="right"/>
-            </w:pPr>
-            <w:r>
-              <w:t xml:space="preserve">117</w:t>
+              <w:t xml:space="preserve">RFD3 selected backbone</w:t>
+            </w:r>
+          </w:p>
+        </w:tc>
+        <w:tc>
+          <w:tcPr/>
+          <w:p>
+            <w:pPr>
+              <w:pStyle w:val="Compact"/>
+              <w:jc w:val="right"/>
+            </w:pPr>
+            <w:r>
+              <w:t xml:space="preserve">120</w:t>
             </w:r>
           </w:p>
         </w:tc>
@@ -2580,19 +2580,81 @@
               <w:jc w:val="right"/>
             </w:pPr>
             <w:r>
-              <w:t xml:space="preserve">85.58</w:t>
-            </w:r>
-          </w:p>
-        </w:tc>
-        <w:tc>
-          <w:tcPr/>
-          <w:p>
-            <w:pPr>
-              <w:pStyle w:val="Compact"/>
-              <w:jc w:val="right"/>
-            </w:pPr>
-            <w:r>
-              <w:t xml:space="preserve">0.759</w:t>
+              <w:t xml:space="preserve">92.53</w:t>
+            </w:r>
+          </w:p>
+        </w:tc>
+        <w:tc>
+          <w:tcPr/>
+          <w:p>
+            <w:pPr>
+              <w:pStyle w:val="Compact"/>
+              <w:jc w:val="right"/>
+            </w:pPr>
+            <w:r>
+              <w:t xml:space="preserve">0.690</w:t>
+            </w:r>
+          </w:p>
+        </w:tc>
+      </w:tr>
+      <w:tr>
+        <w:tc>
+          <w:tcPr/>
+          <w:p>
+            <w:pPr>
+              <w:pStyle w:val="Compact"/>
+              <w:jc w:val="left"/>
+            </w:pPr>
+            <w:r>
+              <w:t xml:space="preserve">RFD3 + BioEmu ensemble</w:t>
+            </w:r>
+          </w:p>
+        </w:tc>
+        <w:tc>
+          <w:tcPr/>
+          <w:p>
+            <w:pPr>
+              <w:pStyle w:val="Compact"/>
+              <w:jc w:val="right"/>
+            </w:pPr>
+            <w:r>
+              <w:t xml:space="preserve">120</w:t>
+            </w:r>
+          </w:p>
+        </w:tc>
+        <w:tc>
+          <w:tcPr/>
+          <w:p>
+            <w:pPr>
+              <w:pStyle w:val="Compact"/>
+              <w:jc w:val="right"/>
+            </w:pPr>
+            <w:r>
+              <w:t xml:space="preserve">30</w:t>
+            </w:r>
+          </w:p>
+        </w:tc>
+        <w:tc>
+          <w:tcPr/>
+          <w:p>
+            <w:pPr>
+              <w:pStyle w:val="Compact"/>
+              <w:jc w:val="right"/>
+            </w:pPr>
+            <w:r>
+              <w:t xml:space="preserve">95.44</w:t>
+            </w:r>
+          </w:p>
+        </w:tc>
+        <w:tc>
+          <w:tcPr/>
+          <w:p>
+            <w:pPr>
+              <w:pStyle w:val="Compact"/>
+              <w:jc w:val="right"/>
+            </w:pPr>
+            <w:r>
+              <w:t xml:space="preserve">0.734</w:t>
             </w:r>
           </w:p>
         </w:tc>
@@ -2607,7 +2669,7 @@
           <w:iCs/>
           <w:i/>
         </w:rPr>
-        <w:t xml:space="preserve">Table 7. Structural-context pilot summary. Values are target-level means over three CATH targets and one replicate per target-arm condition. The pilot supports structural-context exploration as a measurable workflow variable, not a universal performance advantage for a particular generator.</w:t>
+        <w:t xml:space="preserve">Table 7. Structural-context ablation summary. Values are target-level means over evaluable target-arm pairs and one replicate per target-arm condition. BioEmu-containing rows include four RMSD-gate-passing targets, whereas single and RFD3 rows include all eight corrected-chain targets; paired contrasts are therefore interpreted within common target subsets.</w:t>
       </w:r>
     </w:p>
     <w:bookmarkEnd w:id="46"/>
@@ -2650,7 +2712,7 @@
         <w:pStyle w:val="BodyText"/>
       </w:pPr>
       <w:r>
-        <w:t xml:space="preserve">The structural-context result reframes backbone and ensemble stages as allocation levers. If observed variance were mainly within a target, deeper ProteinMPNN sampling would be the primary way to spend compute. Instead, target identity dominates the current stored benchmark, and the RFD3 pilot shows target-dependent tradeoffs. The next analysis should therefore compare single, BioEmu, RFD3, and RFD3+BioEmu contexts across a corrected-chain target set rather than treating RFD3 or BioEmu as default score-improvement modules. In that comparison, BioEmu coverage is itself an informative workflow outcome: failure to obtain near-target conformers under the pre-specified RMSD gate is a QC limitation of that structural-context arm, not evidence that the downstream sequences are biologically poor. The updated RAPID scripts now support both the four-arm comparison and the BioEmu sampling-budget sensitivity check.</w:t>
+        <w:t xml:space="preserve">The structural-context result reframes backbone and ensemble stages as allocation levers. If observed variance were mainly within a target, deeper ProteinMPNN sampling would be the primary way to spend compute. Instead, target identity dominates the stored benchmark, and the corrected-chain structural-context ablation shows target-dependent tradeoffs under matched AF2 caps. RFD3 changed outcomes for some targets but did not improve the aggregate Top-5 pLDDT relative to the single-backbone arm. BioEmu-containing arms were quantitatively evaluable only for the four targets satisfying the pre-specified RMSD gate, where they increased soluble-expression scores and sequence diversity more clearly than structural-confidence scores. This pattern argues for treating RFD3 and BioEmu as controlled exploration levers with explicit QC, rather than as default score-improvement modules.</w:t>
       </w:r>
     </w:p>
     <w:p>
@@ -2676,7 +2738,7 @@
         <w:pStyle w:val="FirstParagraph"/>
       </w:pPr>
       <w:r>
-        <w:t xml:space="preserve">The current evidence is computational and proxy-based. pLDDT, SoluProt, and relax scores do not establish soluble expression, thermodynamic stability, or activity without wet-lab validation. The current surrogate-triage benchmark is based on a stored 23-target QC-passing artifact set generated before the final corrected-chain CATH refresh, so it should be interpreted as component-level evidence for AF2 triage rather than as the final population estimate. The experimental-feedback evolution interface can ingest assay labels and recommend the next candidate set, but no prospective wet-lab enrichment result is claimed here. The completed structural-context pilot covers three targets and does not include BioEmu arms; it is sufficient to motivate the four-arm RAPID ablation but not to claim a universal advantage for RFD3, BioEmu, or their combination. Optional diagnostic summaries are used for audit and failure review only; they are not evaluated here as autonomous mutation-policy models.</w:t>
+        <w:t xml:space="preserve">The current evidence is computational and proxy-based. pLDDT, SoluProt, and relax scores do not establish soluble expression, thermodynamic stability, or activity without wet-lab validation. The current surrogate-triage benchmark is based on a stored 23-target QC-passing artifact set generated before the final corrected-chain CATH refresh, so it should be interpreted as component-level evidence for AF2 triage rather than as the final population estimate. The experimental-feedback evolution interface can ingest assay labels and recommend the next candidate set, but no prospective wet-lab enrichment result is claimed here. The corrected-chain structural-context ablation covers eight targets, but BioEmu-containing arms are evaluable for only four targets under the fixed RMSD gate; this is sufficient to test structural-context allocation as a workflow variable, not to claim a universal advantage for RFD3, BioEmu, or their combination. Optional diagnostic summaries are used for audit and failure review only; they are not evaluated here as autonomous mutation-policy models.</w:t>
       </w:r>
     </w:p>
     <w:bookmarkEnd w:id="49"/>

</xml_diff>

<commit_message>
feat: add GPU ESM surrogate triage support
</commit_message>
<xml_diff>
--- a/docs/manuscript.docx
+++ b/docs/manuscript.docx
@@ -621,7 +621,7 @@
         <w:pStyle w:val="FirstParagraph"/>
       </w:pPr>
       <w:r>
-        <w:t xml:space="preserve">RAPID separates two related uses of surrogates. The first is a computational AF2-budgeted triage mode used in the benchmark (Figure 2). ProteinMPNN first generates a candidate pool across conservation tiers, and SoluProt scores every candidate. SoluProt-passing candidates are embedded with mean-pooled ESM-2 8M embeddings [4]. K-means selects a diverse bootstrap training set, AF2 labels those candidates, and local surrogate policies are compared by internal cross-validation on the labelled set. The selected acquisition policy is then refit on all bootstrap labels and used to rank the remaining SoluProt-passing pool. AF2 evaluates only the selected policy’s Top-K candidates. This mode is a compute-allocation policy for structure prediction, not evidence of experimental activity or expression.</w:t>
+        <w:t xml:space="preserve">RAPID separates two related uses of surrogates. The first is a computational AF2-budgeted triage mode used in the benchmark (Figure 2). ProteinMPNN first generates a candidate pool across conservation tiers, and SoluProt scores every candidate. SoluProt-passing candidates are embedded with mean-pooled ESM-2 8M embeddings [4]. In deployment, this embedding stage can be backed by a GPU ESM worker, allowing large ProteinMPNN pools to be featurized without expanding the AF2/ColabFold acquisition budget. K-means selects a diverse bootstrap training set, AF2 labels those candidates, and local surrogate policies are compared by internal cross-validation on the labelled set. The selected acquisition policy is then refit on all bootstrap labels and used to rank the remaining SoluProt-passing pool. AF2 evaluates only the selected policy’s Top-K candidates. This mode is a compute-allocation policy for structure prediction, not evidence of experimental activity or expression.</w:t>
       </w:r>
     </w:p>
     <w:p>
@@ -813,7 +813,7 @@
         <w:pStyle w:val="FirstParagraph"/>
       </w:pPr>
       <w:r>
-        <w:t xml:space="preserve">The structural-context claim is tested by running matched design and AF2 budgets across four arms: the original target backbone, target plus BioEmu conformational samples, a selected RFD3 backbone, and a combined RFD3+BioEmu ensemble. The updated RAPID ablation script records the planned backbone count, planned design count, RFD3 settings, BioEmu settings, and AF2 budget for every target-arm pair. Each target-arm run caps AF2 at 30 candidates, so differences are interpreted as structural-context allocation effects rather than as unrestricted additional folding. BioEmu-containing arms are evaluated only when the requested near-target conformers pass the pre-specified target-RMSD gate. Arms that fail this gate are reported as not evaluable for that comparison, rather than being assigned zero-valued design scores, because the failure indicates that the conformational-sampling contract was not satisfied.</w:t>
+        <w:t xml:space="preserve">The structural-context claim is tested by running matched design and AF2 budgets across four arms: the original target backbone, target plus BioEmu conformational samples, a selected RFD3 backbone, and a combined RFD3+BioEmu ensemble. Because ProteinMPNN conditions sequence generation on the supplied backbone, changing the backbone or conformational context changes the accessible sequence neighbourhood even when the masking rule and sampling budget are held fixed. The updated RAPID ablation script records the planned backbone count, planned design count, RFD3 settings, BioEmu settings, and AF2 budget for every target-arm pair. Each target-arm run caps AF2 at 30 candidates, so differences are interpreted as structural-context allocation effects rather than as unrestricted additional folding. BioEmu-containing arms are evaluated only when the requested near-target conformers pass the pre-specified target-RMSD gate. Arms that fail this gate are reported as not evaluable for that comparison, rather than being assigned zero-valued design scores, because the failure indicates that the conformational-sampling contract was not satisfied.</w:t>
       </w:r>
     </w:p>
     <w:tbl>
@@ -1990,7 +1990,7 @@
         <w:pStyle w:val="BodyText"/>
       </w:pPr>
       <w:r>
-        <w:t xml:space="preserve">Two representative historical in-silico traces verify that the computational surrogate path is implemented end to end. The 3RGK run evaluated 94 AF2 records from 8,000 SoluProt-gated candidates, and the 1LVM run evaluated 49 AF2 records from 8,000 SoluProt-gated candidates. These traces demonstrate pool generation, SoluProt gating, ESM embedding, K-means bootstrap labelling, surrogate ranking, AF2 acquisition, and final design selection within the stored artifact model. They are not treated as paired biological validation because they cover two targets, use computational pLDDT labels, and have different Top-K settings. The current paper-run script for claim 2 uses the standard surrogate-triage mode rather than experimental-feedback evolution, so the computational budget claim and the wet-lab feedback interface remain separate.</w:t>
+        <w:t xml:space="preserve">Two representative historical in-silico traces verify that the computational surrogate path is implemented end to end. The 3RGK run evaluated 94 AF2 records from 8,000 SoluProt-gated candidates, and the 1LVM run evaluated 49 AF2 records from 8,000 SoluProt-gated candidates. These traces demonstrate pool generation, SoluProt gating, ESM embedding, K-means bootstrap labelling, surrogate ranking, AF2 acquisition, and final design selection within the stored artifact model. The current operating path uses a GPU-capable ESM embedding provider so that 10,000-candidate pools can be ranked while retaining the fixed 30 bootstrap plus 20 Top-K AF2 budget. The traces are not treated as paired biological validation because they cover two targets, use computational pLDDT labels, and have different Top-K settings. The current paper-run script for claim 2 uses the standard surrogate-triage mode rather than experimental-feedback evolution, so the computational budget claim and the wet-lab feedback interface remain separate.</w:t>
       </w:r>
     </w:p>
     <w:bookmarkEnd w:id="39"/>
@@ -2340,11 +2340,13 @@
         <w:jc w:val="start"/>
       </w:tblPr>
       <w:tblGrid>
-        <w:gridCol w:w="1250"/>
-        <w:gridCol w:w="1667"/>
-        <w:gridCol w:w="1667"/>
-        <w:gridCol w:w="1667"/>
-        <w:gridCol w:w="1667"/>
+        <w:gridCol w:w="880"/>
+        <w:gridCol w:w="1173"/>
+        <w:gridCol w:w="1173"/>
+        <w:gridCol w:w="1173"/>
+        <w:gridCol w:w="1173"/>
+        <w:gridCol w:w="1173"/>
+        <w:gridCol w:w="1173"/>
       </w:tblGrid>
       <w:tr>
         <w:trPr>
@@ -2370,6 +2372,18 @@
               <w:jc w:val="right"/>
             </w:pPr>
             <w:r>
+              <w:t xml:space="preserve">Evaluable targets</w:t>
+            </w:r>
+          </w:p>
+        </w:tc>
+        <w:tc>
+          <w:tcPr/>
+          <w:p>
+            <w:pPr>
+              <w:pStyle w:val="Compact"/>
+              <w:jc w:val="right"/>
+            </w:pPr>
+            <w:r>
               <w:t xml:space="preserve">Designs per target</w:t>
             </w:r>
           </w:p>
@@ -2407,6 +2421,18 @@
             </w:pPr>
             <w:r>
               <w:t xml:space="preserve">Top-5 SoluProt</w:t>
+            </w:r>
+          </w:p>
+        </w:tc>
+        <w:tc>
+          <w:tcPr/>
+          <w:p>
+            <w:pPr>
+              <w:pStyle w:val="Compact"/>
+              <w:jc w:val="right"/>
+            </w:pPr>
+            <w:r>
+              <w:t xml:space="preserve">Paired Top-5 pLDDT delta vs single</w:t>
             </w:r>
           </w:p>
         </w:tc>
@@ -2432,6 +2458,18 @@
               <w:jc w:val="right"/>
             </w:pPr>
             <w:r>
+              <w:t xml:space="preserve">8</w:t>
+            </w:r>
+          </w:p>
+        </w:tc>
+        <w:tc>
+          <w:tcPr/>
+          <w:p>
+            <w:pPr>
+              <w:pStyle w:val="Compact"/>
+              <w:jc w:val="right"/>
+            </w:pPr>
+            <w:r>
               <w:t xml:space="preserve">120</w:t>
             </w:r>
           </w:p>
@@ -2469,6 +2507,18 @@
             </w:pPr>
             <w:r>
               <w:t xml:space="preserve">0.718</w:t>
+            </w:r>
+          </w:p>
+        </w:tc>
+        <w:tc>
+          <w:tcPr/>
+          <w:p>
+            <w:pPr>
+              <w:pStyle w:val="Compact"/>
+              <w:jc w:val="right"/>
+            </w:pPr>
+            <w:r>
+              <w:t xml:space="preserve">reference</w:t>
             </w:r>
           </w:p>
         </w:tc>
@@ -2494,6 +2544,18 @@
               <w:jc w:val="right"/>
             </w:pPr>
             <w:r>
+              <w:t xml:space="preserve">4</w:t>
+            </w:r>
+          </w:p>
+        </w:tc>
+        <w:tc>
+          <w:tcPr/>
+          <w:p>
+            <w:pPr>
+              <w:pStyle w:val="Compact"/>
+              <w:jc w:val="right"/>
+            </w:pPr>
+            <w:r>
               <w:t xml:space="preserve">120</w:t>
             </w:r>
           </w:p>
@@ -2531,6 +2593,18 @@
             </w:pPr>
             <w:r>
               <w:t xml:space="preserve">0.788</w:t>
+            </w:r>
+          </w:p>
+        </w:tc>
+        <w:tc>
+          <w:tcPr/>
+          <w:p>
+            <w:pPr>
+              <w:pStyle w:val="Compact"/>
+              <w:jc w:val="right"/>
+            </w:pPr>
+            <w:r>
+              <w:t xml:space="preserve">-0.14</w:t>
             </w:r>
           </w:p>
         </w:tc>
@@ -2556,6 +2630,18 @@
               <w:jc w:val="right"/>
             </w:pPr>
             <w:r>
+              <w:t xml:space="preserve">8</w:t>
+            </w:r>
+          </w:p>
+        </w:tc>
+        <w:tc>
+          <w:tcPr/>
+          <w:p>
+            <w:pPr>
+              <w:pStyle w:val="Compact"/>
+              <w:jc w:val="right"/>
+            </w:pPr>
+            <w:r>
               <w:t xml:space="preserve">120</w:t>
             </w:r>
           </w:p>
@@ -2593,6 +2679,18 @@
             </w:pPr>
             <w:r>
               <w:t xml:space="preserve">0.690</w:t>
+            </w:r>
+          </w:p>
+        </w:tc>
+        <w:tc>
+          <w:tcPr/>
+          <w:p>
+            <w:pPr>
+              <w:pStyle w:val="Compact"/>
+              <w:jc w:val="right"/>
+            </w:pPr>
+            <w:r>
+              <w:t xml:space="preserve">-0.05</w:t>
             </w:r>
           </w:p>
         </w:tc>
@@ -2618,6 +2716,18 @@
               <w:jc w:val="right"/>
             </w:pPr>
             <w:r>
+              <w:t xml:space="preserve">4</w:t>
+            </w:r>
+          </w:p>
+        </w:tc>
+        <w:tc>
+          <w:tcPr/>
+          <w:p>
+            <w:pPr>
+              <w:pStyle w:val="Compact"/>
+              <w:jc w:val="right"/>
+            </w:pPr>
+            <w:r>
               <w:t xml:space="preserve">120</w:t>
             </w:r>
           </w:p>
@@ -2655,6 +2765,18 @@
             </w:pPr>
             <w:r>
               <w:t xml:space="preserve">0.734</w:t>
+            </w:r>
+          </w:p>
+        </w:tc>
+        <w:tc>
+          <w:tcPr/>
+          <w:p>
+            <w:pPr>
+              <w:pStyle w:val="Compact"/>
+              <w:jc w:val="right"/>
+            </w:pPr>
+            <w:r>
+              <w:t xml:space="preserve">-0.98</w:t>
             </w:r>
           </w:p>
         </w:tc>
@@ -2669,7 +2791,7 @@
           <w:iCs/>
           <w:i/>
         </w:rPr>
-        <w:t xml:space="preserve">Table 7. Structural-context ablation summary. Values are target-level means over evaluable target-arm pairs and one replicate per target-arm condition. BioEmu-containing rows include four RMSD-gate-passing targets, whereas single and RFD3 rows include all eight corrected-chain targets; paired contrasts are therefore interpreted within common target subsets.</w:t>
+        <w:t xml:space="preserve">Table 7. Structural-context ablation summary. Values are target-level means over evaluable target-arm pairs and one replicate per target-arm condition. BioEmu-containing rows include four RMSD-gate-passing targets, whereas single and RFD3 rows include all eight corrected-chain targets. The final column reports paired Top-5 pLDDT contrasts within the common target subset for each arm, preventing the unpaired row means from being interpreted as a universal BioEmu or RFD3 advantage.</w:t>
       </w:r>
     </w:p>
     <w:bookmarkEnd w:id="46"/>

</xml_diff>

<commit_message>
feat: pool surrogate triage across conservation tiers
</commit_message>
<xml_diff>
--- a/docs/manuscript.docx
+++ b/docs/manuscript.docx
@@ -37,7 +37,7 @@
         <w:pStyle w:val="FirstParagraph"/>
       </w:pPr>
       <w:r>
-        <w:t xml:space="preserve">Solubility-aware protein redesign increasingly depends on heterogeneous AI models for sequence search, conservation analysis, backbone or conformational sampling, inverse folding, soluble-expression filtering, structure prediction, and novelty assessment. These components are powerful individually, but practical campaigns often connect them with ad hoc scripts, making runs difficult to reproduce, rerun, compare, or update when a model backend changes. We present RAPID, a reproducible artifact pipeline for integrated design that turns fragmented model outputs into a stage-aware, run-scoped experimental substrate for solubility-aware multiple-mutant redesign. RAPID preserves typed requests, intermediate artifacts, status histories, orchestration traces, experiment records, quality-control records, and final summaries under stable run identifiers, allowing downstream analyses to be regenerated from stored artifacts rather than from repeated live model calls. We use RAPID to support three claims. First, an artifact contract and local/static interface make model replacement and retrospective analysis operational rather than manual. Second, an AF2-budgeted surrogate triage mode reduces structure-prediction use after SoluProt gating by using ESM-2 embeddings, K-means bootstrap selection, internal cross-validation of local surrogate policies, and Top-K acquisition; in the current artifact benchmark, K-means gives its largest advantage in the small-label regime, Random Forest is a conservative pLDDT-oriented policy, and the implemented default evaluates 30 bootstrap candidates plus 20 Top-K candidates selected by the best internally cross-validated acquisition policy when the SoluProt-passing pool exceeds this budget. Third, target-level variation dominates observed design-quality variation, motivating explicit tests of compute allocation across single-target, BioEmu, RFD3, and RFD3+BioEmu structural contexts rather than simply increasing sequence sampling around one backbone. RAPID also exposes an experimental-feedback evolution mode that writes candidate sets for wet-lab testing and can train the next surrogate from user-supplied objective values. The present evidence is computational and proxy-based: pLDDT, SoluProt, and relax scores do not establish wet-lab soluble expression, thermodynamic stability, or activity. RAPID is therefore positioned as reproducible infrastructure for solubility-aware redesign and compute allocation, with final biological validation left to experimental follow-up.</w:t>
+        <w:t xml:space="preserve">Solubility-aware protein redesign increasingly depends on heterogeneous AI models for sequence search, conservation analysis, backbone or conformational sampling, inverse folding, soluble-expression filtering, structure prediction, and novelty assessment. These components are powerful individually, but practical campaigns often connect them with ad hoc scripts, making runs difficult to reproduce, rerun, compare, or update when a model backend changes. We present RAPID, a reproducible artifact pipeline for integrated design that turns fragmented model outputs into a stage-aware, run-scoped experimental substrate for solubility-aware multiple-mutant redesign. RAPID preserves typed requests, intermediate artifacts, status histories, orchestration traces, experiment records, quality-control records, and final summaries under stable run identifiers, allowing downstream analyses to be regenerated from stored artifacts rather than from repeated live model calls. We use RAPID to support three claims. First, an artifact contract and local/static interface make model replacement and retrospective analysis operational rather than manual. Second, an AF2-budgeted surrogate triage mode reduces structure-prediction use after SoluProt gating by using ESM-2 embeddings, K-means bootstrap selection, internal cross-validation of local surrogate policies, and Top-K acquisition; in the current artifact benchmark, K-means gives its largest advantage in the small-label regime, Random Forest is a conservative pLDDT-oriented policy, and the implemented default generates a pooled 30/50/70% conservation-tier candidate set, labels 30 bootstrap candidates, and evaluates 20 Top-K candidates selected by the best internally cross-validated acquisition policy when the SoluProt-passing pool exceeds this budget. Third, target-level variation dominates observed design-quality variation, motivating explicit tests of compute allocation across single-target, BioEmu, RFD3, and RFD3+BioEmu structural contexts rather than simply increasing sequence sampling around one backbone. RAPID also exposes an experimental-feedback evolution mode that writes candidate sets for wet-lab testing and can train the next surrogate from user-supplied objective values. The present evidence is computational and proxy-based: pLDDT, SoluProt, and relax scores do not establish wet-lab soluble expression, thermodynamic stability, or activity. RAPID is therefore positioned as reproducible infrastructure for solubility-aware redesign and compute allocation, with final biological validation left to experimental follow-up.</w:t>
       </w:r>
     </w:p>
     <w:bookmarkEnd w:id="20"/>
@@ -629,7 +629,7 @@
         <w:pStyle w:val="BodyText"/>
       </w:pPr>
       <w:r>
-        <w:t xml:space="preserve">The production triage default uses 30 K-means-selected bootstrap labels and 20 Top-K AF2 acquisitions. The N = 30 bootstrap was chosen because the sample-size ablation reaches most of the observed Random Forest pLDDT uplift by that point, while Top-K = 20 fixes a target-level validation budget that is large enough for manual review but small enough to keep the AF2 cost explicit. RAPID trains comparator policies on the same labelled bootstrap set, writes cross-validation metrics, a model-comparison SVG, candidate-level predictions, Top-K overlap summaries, feature-importance or coefficient tables, and fitted model files, and then uses only one selected acquisition policy for the final Top-K. Thus model comparison is recorded without multiplying AF2 calls. Manual override remains available for controlled runs using Random Forest, Ridge, XGBoost, LightGBM, or rank-mean ensemble.</w:t>
+        <w:t xml:space="preserve">The production triage default uses one shared budget across the selected 30%, 50%, and 70% conservation tiers. By default, ProteinMPNN generates 3,333 candidates per tier, giving approximately 9,999 designs before SoluProt filtering. RAPID then labels 30 K-means-selected bootstrap candidates from the pooled SoluProt-passing set and evaluates 20 Top-K AF2 acquisitions from the same pooled set. The N = 30 bootstrap was chosen because the sample-size ablation reaches most of the observed Random Forest pLDDT uplift by that point, while Top-K = 20 fixes a target-level validation budget that is large enough for manual review but small enough to keep the AF2 cost explicit. RAPID trains comparator policies on the same labelled bootstrap set, writes cross-validation metrics, a model-comparison SVG, candidate-level predictions, feature-importance or coefficient tables, and fitted model files, and then uses only one selected acquisition policy for the final Top-K. Thus model comparison is recorded without multiplying AF2 calls. Manual override remains available for controlled runs using Random Forest, Ridge, XGBoost, LightGBM, or rank-mean ensemble.</w:t>
       </w:r>
     </w:p>
     <w:p>
@@ -712,7 +712,7 @@
       <w:r>
         <w:drawing>
           <wp:inline>
-            <wp:extent cx="5334000" cy="2435474"/>
+            <wp:extent cx="5334000" cy="2396434"/>
             <wp:effectExtent b="0" l="0" r="0" t="0"/>
             <wp:docPr descr="AF2-budgeted surrogate triage" title="" id="29" name="Picture"/>
             <a:graphic>
@@ -733,7 +733,7 @@
                   <pic:spPr bwMode="auto">
                     <a:xfrm>
                       <a:off x="0" y="0"/>
-                      <a:ext cx="5334000" cy="2435474"/>
+                      <a:ext cx="5334000" cy="2396434"/>
                     </a:xfrm>
                     <a:prstGeom prst="rect">
                       <a:avLst/>
@@ -769,7 +769,7 @@
           <w:iCs/>
           <w:i/>
         </w:rPr>
-        <w:t xml:space="preserve">Figure 2. AF2-budgeted surrogate triage. K-means selects a diverse AF2-labelled bootstrap set from SoluProt-passing candidates. RAPID compares configured local surrogate policies by internal cross-validation, refits the selected policy on all bootstrap labels, and reserves AF2/ColabFold for one Top-K acquisition set. Comparator-model metrics, optional rank-mean ensemble results, feature summaries, fitted model files, and prediction tables are exported as artifacts without expanding the AF2 budget. Experimental-feedback evolution uses the same candidate and embedding contract but learns from user-recorded wet-lab objective values rather than treating AF2 as a biological oracle.</w:t>
+        <w:t xml:space="preserve">Figure 2. AF2-budgeted surrogate triage. ProteinMPNN candidates from the selected conservation tiers are pooled after SoluProt filtering. K-means selects a diverse AF2-labelled bootstrap set from this pooled candidate set. RAPID compares configured local surrogate policies by internal cross-validation, refits the selected policy on all bootstrap labels, and reserves AF2/ColabFold for one pooled Top-K acquisition set. Comparator-model metrics, optional rank-mean ensemble results, feature summaries, fitted model files, and prediction tables are exported as artifacts without expanding the AF2 budget. Experimental-feedback evolution uses the same candidate and embedding contract but learns from user-recorded wet-lab objective values rather than treating AF2 as a biological oracle.</w:t>
       </w:r>
     </w:p>
     <w:bookmarkEnd w:id="31"/>
@@ -1753,7 +1753,34 @@
         <w:pStyle w:val="BodyText"/>
       </w:pPr>
       <w:r>
-        <w:t xml:space="preserve">The budget effect is explicit at the run level. Folding every candidate in a 90-candidate SoluProt-gated pool would require 90 AF2 calls. The implemented surrogate-triage schedule spends 30 calls on the K-means bootstrap set and 20 calls on surrogate-ranked Top-K candidates, for 50 AF2 calls when the pool exceeds this budget. This is a 44% reduction in AF2 evaluations for the representative 90-candidate pool. Larger pools produce larger absolute savings because the triage budget remains fixed while the full-folding baseline scales with the number of SoluProt-passing candidates.</w:t>
+        <w:t xml:space="preserve">The budget effect is explicit at the run level. The default manuscript configuration generates approximately 9,999 candidates across the three conservation tiers before SoluProt filtering. Folding every SoluProt-passing candidate would require one AF2 call per candidate. The implemented pooled surrogate-triage schedule spends 30 calls on the K-means bootstrap set and 20 calls on surrogate-ranked Top-K candidates, for 50 AF2 calls when the pooled SoluProt-passing set exceeds this budget. The reduction is therefore</w:t>
+      </w:r>
+      <w:r>
+        <w:t xml:space="preserve"> </w:t>
+      </w:r>
+      <w:r>
+        <w:rPr>
+          <w:rStyle w:val="VerbatimChar"/>
+        </w:rPr>
+        <w:t xml:space="preserve">1 - 50/P</w:t>
+      </w:r>
+      <w:r>
+        <w:t xml:space="preserve">, where</w:t>
+      </w:r>
+      <w:r>
+        <w:t xml:space="preserve"> </w:t>
+      </w:r>
+      <w:r>
+        <w:rPr>
+          <w:rStyle w:val="VerbatimChar"/>
+        </w:rPr>
+        <w:t xml:space="preserve">P</w:t>
+      </w:r>
+      <w:r>
+        <w:t xml:space="preserve"> </w:t>
+      </w:r>
+      <w:r>
+        <w:t xml:space="preserve">is the number of SoluProt-passing candidates. Larger pools produce larger absolute savings because the triage budget remains fixed while the full-folding baseline scales with the number of candidates that pass SoluProt.</w:t>
       </w:r>
     </w:p>
     <w:tbl>
@@ -1881,19 +1908,19 @@
               <w:jc w:val="left"/>
             </w:pPr>
             <w:r>
-              <w:t xml:space="preserve">One target run, 200 gated candidates</w:t>
-            </w:r>
-          </w:p>
-        </w:tc>
-        <w:tc>
-          <w:tcPr/>
-          <w:p>
-            <w:pPr>
-              <w:pStyle w:val="Compact"/>
-              <w:jc w:val="right"/>
-            </w:pPr>
-            <w:r>
-              <w:t xml:space="preserve">200</w:t>
+              <w:t xml:space="preserve">One target run, 1,000 gated candidates</w:t>
+            </w:r>
+          </w:p>
+        </w:tc>
+        <w:tc>
+          <w:tcPr/>
+          <w:p>
+            <w:pPr>
+              <w:pStyle w:val="Compact"/>
+              <w:jc w:val="right"/>
+            </w:pPr>
+            <w:r>
+              <w:t xml:space="preserve">1,000</w:t>
             </w:r>
           </w:p>
         </w:tc>
@@ -1917,7 +1944,7 @@
               <w:jc w:val="right"/>
             </w:pPr>
             <w:r>
-              <w:t xml:space="preserve">75%</w:t>
+              <w:t xml:space="preserve">95%</w:t>
             </w:r>
           </w:p>
         </w:tc>
@@ -1931,19 +1958,19 @@
               <w:jc w:val="left"/>
             </w:pPr>
             <w:r>
-              <w:t xml:space="preserve">One target run, 1,000 gated candidates</w:t>
-            </w:r>
-          </w:p>
-        </w:tc>
-        <w:tc>
-          <w:tcPr/>
-          <w:p>
-            <w:pPr>
-              <w:pStyle w:val="Compact"/>
-              <w:jc w:val="right"/>
-            </w:pPr>
-            <w:r>
-              <w:t xml:space="preserve">1,000</w:t>
+              <w:t xml:space="preserve">One target run, 9,999 gated candidates</w:t>
+            </w:r>
+          </w:p>
+        </w:tc>
+        <w:tc>
+          <w:tcPr/>
+          <w:p>
+            <w:pPr>
+              <w:pStyle w:val="Compact"/>
+              <w:jc w:val="right"/>
+            </w:pPr>
+            <w:r>
+              <w:t xml:space="preserve">9,999</w:t>
             </w:r>
           </w:p>
         </w:tc>
@@ -1967,7 +1994,7 @@
               <w:jc w:val="right"/>
             </w:pPr>
             <w:r>
-              <w:t xml:space="preserve">95%</w:t>
+              <w:t xml:space="preserve">99.5%</w:t>
             </w:r>
           </w:p>
         </w:tc>
@@ -1982,15 +2009,15 @@
           <w:iCs/>
           <w:i/>
         </w:rPr>
-        <w:t xml:space="preserve">Table 5. AF2 budget model for the standard surrogate-triage mode. The implemented default evaluates 30 K-means bootstrap candidates and 20 Top-K acquisitions selected by one internally cross-validated acquisition policy. Comparator models are trained and exported for audit, but they do not add AF2 calls unless the operator explicitly changes the validation budget. This table is a budget model, not a biological enrichment result; prospective wet-lab outcomes are handled by the separate experimental-feedback evolution mode.</w:t>
-      </w:r>
-    </w:p>
-    <w:p>
-      <w:pPr>
-        <w:pStyle w:val="BodyText"/>
-      </w:pPr>
-      <w:r>
-        <w:t xml:space="preserve">Two representative historical in-silico traces verify that the computational surrogate path is implemented end to end. The 3RGK run evaluated 94 AF2 records from 8,000 SoluProt-gated candidates, and the 1LVM run evaluated 49 AF2 records from 8,000 SoluProt-gated candidates. These traces demonstrate pool generation, SoluProt gating, ESM embedding, K-means bootstrap labelling, surrogate ranking, AF2 acquisition, and final design selection within the stored artifact model. The current operating path uses a GPU-capable ESM embedding provider so that 10,000-candidate pools can be ranked while retaining the fixed 30 bootstrap plus 20 Top-K AF2 budget. The traces are not treated as paired biological validation because they cover two targets, use computational pLDDT labels, and have different Top-K settings. The current paper-run script for claim 2 uses the standard surrogate-triage mode rather than experimental-feedback evolution, so the computational budget claim and the wet-lab feedback interface remain separate.</w:t>
+        <w:t xml:space="preserve">Table 5. AF2 budget model for the standard pooled surrogate-triage mode. The implemented default evaluates 30 K-means bootstrap candidates and 20 Top-K acquisitions selected by one internally cross-validated acquisition policy across the pooled conservation-tier candidate set. Comparator models are trained and exported for audit, but they do not add AF2 calls unless the operator explicitly changes the validation budget. This table is a budget model, not a biological enrichment result; prospective wet-lab outcomes are handled by the separate experimental-feedback evolution mode.</w:t>
+      </w:r>
+    </w:p>
+    <w:p>
+      <w:pPr>
+        <w:pStyle w:val="BodyText"/>
+      </w:pPr>
+      <w:r>
+        <w:t xml:space="preserve">Two representative historical in-silico traces verify that the computational surrogate path is implemented end to end. The 3RGK run evaluated 94 AF2 records from 8,000 SoluProt-gated candidates, and the 1LVM run evaluated 49 AF2 records from 8,000 SoluProt-gated candidates. These traces demonstrate pool generation, SoluProt gating, ESM embedding, K-means bootstrap labelling, surrogate ranking, AF2 acquisition, and final design selection within the stored artifact model. The current operating path uses a GPU-capable ESM embedding provider so that approximately 10,000-candidate pooled multi-tier runs can be ranked while retaining the fixed 30 bootstrap plus 20 Top-K AF2 budget. The traces are not treated as paired biological validation because they cover two targets, use computational pLDDT labels, and have different Top-K settings. The current paper-run script for claim 2 uses the standard surrogate-triage mode rather than experimental-feedback evolution, so the computational budget claim and the wet-lab feedback interface remain separate.</w:t>
       </w:r>
     </w:p>
     <w:bookmarkEnd w:id="39"/>
@@ -2826,7 +2853,7 @@
         <w:pStyle w:val="BodyText"/>
       </w:pPr>
       <w:r>
-        <w:t xml:space="preserve">The surrogate-triage result is similarly bounded. The evidence supports an AF2-allocation policy, not a wet-lab hit-rate claim. K-means is most useful as a cold-start diversity mechanism, Random Forest is a conservative pLDDT acquisition reference, Ridge is useful for SoluProt-oriented ranking, and N = 30 is a cost-efficient bootstrap point in the current artifact benchmark. The current implementation uses those observations to define comparator policies, then selects one acquisition policy by internal CV for each run. These findings justify the implemented budget model because they directly address the expensive AF2 step after SoluProt filtering. The experimental-feedback evolution mode extends the same artifact substrate into a design-test-learn workflow by accepting objective metric values from assay records, but its biological utility must be assessed prospectively.</w:t>
+        <w:t xml:space="preserve">The surrogate-triage result is similarly bounded. The evidence supports an AF2-allocation policy, not a wet-lab hit-rate claim. K-means is most useful as a cold-start diversity mechanism, Random Forest is a conservative pLDDT acquisition reference, Ridge is useful for SoluProt-oriented ranking, and N = 30 is a cost-efficient bootstrap point in the current artifact benchmark. The current implementation uses those observations to define comparator policies, then selects one acquisition policy by internal CV for each run. The retrospective pooled-CATH analysis further argues against prematurely replacing this per-run calibration with a global pooled model. These findings justify the implemented budget model because they directly address the expensive AF2 step after SoluProt filtering while preserving a path for future pooled-model validation. The experimental-feedback evolution mode extends the same artifact substrate into a design-test-learn workflow by accepting objective metric values from assay records, but its biological utility must be assessed prospectively.</w:t>
       </w:r>
     </w:p>
     <w:p>
@@ -2860,7 +2887,7 @@
         <w:pStyle w:val="FirstParagraph"/>
       </w:pPr>
       <w:r>
-        <w:t xml:space="preserve">The current evidence is computational and proxy-based. pLDDT, SoluProt, and relax scores do not establish soluble expression, thermodynamic stability, or activity without wet-lab validation. The current surrogate-triage benchmark is based on a stored 23-target QC-passing artifact set generated before the final corrected-chain CATH refresh, so it should be interpreted as component-level evidence for AF2 triage rather than as the final population estimate. The experimental-feedback evolution interface can ingest assay labels and recommend the next candidate set, but no prospective wet-lab enrichment result is claimed here. The corrected-chain structural-context ablation covers eight targets, but BioEmu-containing arms are evaluable for only four targets under the fixed RMSD gate; this is sufficient to test structural-context allocation as a workflow variable, not to claim a universal advantage for RFD3, BioEmu, or their combination. Optional diagnostic summaries are used for audit and failure review only; they are not evaluated here as autonomous mutation-policy models.</w:t>
+        <w:t xml:space="preserve">The current evidence is computational and proxy-based. pLDDT, SoluProt, and relax scores do not establish soluble expression, thermodynamic stability, or activity without wet-lab validation. The current surrogate-triage benchmark is based on a stored 23-target QC-passing artifact set generated before the final corrected-chain CATH refresh, so it should be interpreted as component-level evidence for AF2 triage rather than as the final population estimate. The completed corrected-chain CATH archive was sufficient to test pooled surrogate accumulation, but not to show a stable pooled-model advantage over target-specific calibration. The experimental-feedback evolution interface can ingest assay labels and recommend the next candidate set, but no prospective wet-lab enrichment result is claimed here. The corrected-chain structural-context ablation covers eight targets, but BioEmu-containing arms are evaluable for only four targets under the fixed RMSD gate; this is sufficient to test structural-context allocation as a workflow variable, not to claim a universal advantage for RFD3, BioEmu, or their combination. Optional diagnostic summaries are used for audit and failure review only; they are not evaluated here as autonomous mutation-policy models.</w:t>
       </w:r>
     </w:p>
     <w:bookmarkEnd w:id="49"/>

</xml_diff>

<commit_message>
docs: frame pooled surrogate scaling as guardrail
</commit_message>
<xml_diff>
--- a/docs/manuscript.docx
+++ b/docs/manuscript.docx
@@ -2853,7 +2853,15 @@
         <w:pStyle w:val="BodyText"/>
       </w:pPr>
       <w:r>
-        <w:t xml:space="preserve">The surrogate-triage result is similarly bounded. The evidence supports an AF2-allocation policy, not a wet-lab hit-rate claim. K-means is most useful as a cold-start diversity mechanism, Random Forest is a conservative pLDDT acquisition reference, Ridge is useful for SoluProt-oriented ranking, and N = 30 is a cost-efficient bootstrap point in the current artifact benchmark. The current implementation uses those observations to define comparator policies, then selects one acquisition policy by internal CV for each run. The retrospective pooled-CATH analysis further argues against prematurely replacing this per-run calibration with a global pooled model. These findings justify the implemented budget model because they directly address the expensive AF2 step after SoluProt filtering while preserving a path for future pooled-model validation. The experimental-feedback evolution mode extends the same artifact substrate into a design-test-learn workflow by accepting objective metric values from assay records, but its biological utility must be assessed prospectively.</w:t>
+        <w:t xml:space="preserve">The surrogate-triage result is similarly bounded. The evidence supports an AF2-allocation policy, not a wet-lab hit-rate claim. K-means is most useful as a cold-start diversity mechanism, Random Forest is a conservative pLDDT acquisition reference, Ridge is useful for SoluProt-oriented ranking, and N = 30 is a cost-efficient bootstrap point in the current artifact benchmark. The current implementation uses those observations to define comparator policies, then selects one acquisition policy by internal CV for each run. The retrospective pooled-CATH analysis further argues against prematurely replacing this per-run calibration with a global pooled model. This is a guardrail result rather than a contradiction of the platform design: under the current feature set and label volume, accumulated computational labels are useful for audit and future modelling, but they do not yet justify a transferable surrogate that supersedes target-local calibration. These findings justify RAPID’s implemented default as a lightweight, run-specific orchestration policy for the expensive AF2 step after SoluProt filtering. The experimental-feedback evolution mode extends the same artifact substrate into a design-test-learn workflow by accepting objective metric values from assay records, but its biological utility must be assessed prospectively.</w:t>
+      </w:r>
+    </w:p>
+    <w:p>
+      <w:pPr>
+        <w:pStyle w:val="BodyText"/>
+      </w:pPr>
+      <w:r>
+        <w:t xml:space="preserve">This framing also defines the longer-term learning path. RAPID’s near-term role is local surrogate orchestration: each run creates a candidate pool, labels a small diverse subset, and fits a task-specific acquisition model. The next step is not simply to train a larger sequence generator, but to accumulate a preference dataset from redesign decisions, including AF2 labels, assay labels, paired rankings, target metadata, structural context, conservation tier, and sequence-edit histories. Only after this substrate becomes sufficiently dense should a target-conditioned preference model be treated as a performance claim. In this sense, the platform is designed for biofoundry-scale learning because it records the full redesign process, not only the final selected sequences.</w:t>
       </w:r>
     </w:p>
     <w:p>
@@ -2887,7 +2895,7 @@
         <w:pStyle w:val="FirstParagraph"/>
       </w:pPr>
       <w:r>
-        <w:t xml:space="preserve">The current evidence is computational and proxy-based. pLDDT, SoluProt, and relax scores do not establish soluble expression, thermodynamic stability, or activity without wet-lab validation. The current surrogate-triage benchmark is based on a stored 23-target QC-passing artifact set generated before the final corrected-chain CATH refresh, so it should be interpreted as component-level evidence for AF2 triage rather than as the final population estimate. The completed corrected-chain CATH archive was sufficient to test pooled surrogate accumulation, but not to show a stable pooled-model advantage over target-specific calibration. The experimental-feedback evolution interface can ingest assay labels and recommend the next candidate set, but no prospective wet-lab enrichment result is claimed here. The corrected-chain structural-context ablation covers eight targets, but BioEmu-containing arms are evaluable for only four targets under the fixed RMSD gate; this is sufficient to test structural-context allocation as a workflow variable, not to claim a universal advantage for RFD3, BioEmu, or their combination. Optional diagnostic summaries are used for audit and failure review only; they are not evaluated here as autonomous mutation-policy models.</w:t>
+        <w:t xml:space="preserve">The current evidence is computational and proxy-based. pLDDT, SoluProt, and relax scores do not establish soluble expression, thermodynamic stability, or activity without wet-lab validation. The current surrogate-triage benchmark is based on a stored 23-target QC-passing artifact set generated before the final corrected-chain CATH refresh, so it should be interpreted as component-level evidence for AF2 triage rather than as the final population estimate. The completed corrected-chain CATH archive was sufficient to test pooled surrogate accumulation, but not to show a stable pooled-model advantage over target-specific calibration; we therefore treat this result as support for the current per-run adaptive default and as motivation for future preference-dataset accumulation. The experimental-feedback evolution interface can ingest assay labels and recommend the next candidate set, but no prospective wet-lab enrichment result is claimed here. The corrected-chain structural-context ablation covers eight targets, but BioEmu-containing arms are evaluable for only four targets under the fixed RMSD gate; this is sufficient to test structural-context allocation as a workflow variable, not to claim a universal advantage for RFD3, BioEmu, or their combination. Optional diagnostic summaries are used for audit and failure review only; they are not evaluated here as autonomous mutation-policy models.</w:t>
       </w:r>
     </w:p>
     <w:bookmarkEnd w:id="49"/>
@@ -2913,7 +2921,7 @@
         <w:pStyle w:val="BodyText"/>
       </w:pPr>
       <w:r>
-        <w:t xml:space="preserve">The manuscript’s central claims are intentionally limited. RAPID makes fragmented model outputs reusable; it reduces AF2/ColabFold evaluations for post-SoluProt triage; and it makes structural-context allocation testable across single, BioEmu, RFD3, and combined contexts. These claims are suitable for a software and empirical benchmark paper because they are tied to stored artifacts, explicit budgets, and reproducible scripts. Experimental solubility, stability, and activity remain future validation targets rather than claims of the present work, even though the software now provides the data path needed to incorporate those measurements in subsequent rounds.</w:t>
+        <w:t xml:space="preserve">The manuscript’s central claims are intentionally limited. RAPID makes fragmented model outputs reusable; it reduces AF2/ColabFold evaluations for post-SoluProt triage; and it makes structural-context allocation testable across single, BioEmu, RFD3, and combined contexts. These claims are suitable for a software and empirical benchmark paper because they are tied to stored artifacts, explicit budgets, and reproducible scripts. Experimental solubility, stability, and activity remain future validation targets rather than claims of the present work, even though the software now provides the data path needed to incorporate those measurements in subsequent rounds. The longer-term contribution is therefore a reusable learning substrate for protein redesign: as computational and assay labels accumulate under the same artifact contract, future work can move from per-run surrogates toward target-conditioned preference models without losing provenance.</w:t>
       </w:r>
     </w:p>
     <w:bookmarkEnd w:id="50"/>

</xml_diff>

<commit_message>
release: package RAPID public release
</commit_message>
<xml_diff>
--- a/docs/manuscript.docx
+++ b/docs/manuscript.docx
@@ -2,13 +2,13 @@
 <file path=word/document.xml><?xml version="1.0" encoding="utf-8"?>
 <w:document xmlns:w="http://schemas.openxmlformats.org/wordprocessingml/2006/main" xmlns:m="http://schemas.openxmlformats.org/officeDocument/2006/math" xmlns:r="http://schemas.openxmlformats.org/officeDocument/2006/relationships" xmlns:o="urn:schemas-microsoft-com:office:office" xmlns:v="urn:schemas-microsoft-com:vml" xmlns:w10="urn:schemas-microsoft-com:office:word" xmlns:a="http://schemas.openxmlformats.org/drawingml/2006/main" xmlns:pic="http://schemas.openxmlformats.org/drawingml/2006/picture" xmlns:wp="http://schemas.openxmlformats.org/drawingml/2006/wordprocessingDrawing">
   <w:body>
-    <w:bookmarkStart w:id="53" w:name="X0be2dac2cd77b68e09ed60b1658027c9f05d2e6"/>
+    <w:bookmarkStart w:id="53" w:name="X527d372d79165dadd872087c1c3ec262468715d"/>
     <w:p>
       <w:pPr>
         <w:pStyle w:val="Heading1"/>
       </w:pPr>
       <w:r>
-        <w:t xml:space="preserve">RAPID: A Reproducible Artifact Pipeline for Solubility-Aware Protein Redesign with AF2-Budgeted Surrogate Triage</w:t>
+        <w:t xml:space="preserve">RAPID: A Reproducible Artifact Pipeline for Solubility-Aware Protein Redesign with Budget-Aware Surrogate Triage</w:t>
       </w:r>
     </w:p>
     <w:p>
@@ -37,7 +37,7 @@
         <w:pStyle w:val="FirstParagraph"/>
       </w:pPr>
       <w:r>
-        <w:t xml:space="preserve">Solubility-aware protein redesign increasingly depends on heterogeneous AI models for sequence search, conservation analysis, backbone or conformational sampling, inverse folding, soluble-expression filtering, structure prediction, and novelty assessment. These components are powerful individually, but practical campaigns often connect them with ad hoc scripts, making runs difficult to reproduce, rerun, compare, or update when a model backend changes. We present RAPID, a reproducible artifact pipeline for integrated design that turns fragmented model outputs into a stage-aware, run-scoped experimental substrate for solubility-aware multiple-mutant redesign. RAPID preserves typed requests, intermediate artifacts, status histories, orchestration traces, experiment records, quality-control records, and final summaries under stable run identifiers, allowing downstream analyses to be regenerated from stored artifacts rather than from repeated live model calls. We use RAPID to support three claims. First, an artifact contract and local/static interface make model replacement and retrospective analysis operational rather than manual. Second, an AF2-budgeted surrogate triage mode reduces structure-prediction use after SoluProt gating by using ESM-2 embeddings, K-means bootstrap selection, internal cross-validation of local surrogate policies, and Top-K acquisition; in the current artifact benchmark, K-means gives its largest advantage in the small-label regime, Random Forest is a conservative pLDDT-oriented policy, and the implemented default generates a pooled 30/50/70% conservation-tier candidate set, labels 30 bootstrap candidates, and evaluates 20 Top-K candidates selected by the best internally cross-validated acquisition policy when the SoluProt-passing pool exceeds this budget. Third, target-level variation dominates observed design-quality variation, motivating explicit tests of compute allocation across single-target, BioEmu, RFD3, and RFD3+BioEmu structural contexts rather than simply increasing sequence sampling around one backbone. RAPID also exposes an experimental-feedback evolution mode that writes candidate sets for wet-lab testing and can train the next surrogate from user-supplied objective values. The present evidence is computational and proxy-based: pLDDT, SoluProt, and relax scores do not establish wet-lab soluble expression, thermodynamic stability, or activity. RAPID is therefore positioned as reproducible infrastructure for solubility-aware redesign and compute allocation, with final biological validation left to experimental follow-up.</w:t>
+        <w:t xml:space="preserve">Solubility-aware protein redesign increasingly combines sequence search, conservation analysis, structural-context sampling, inverse folding, soluble-expression filtering, structure prediction, and novelty assessment. These models are powerful individually, but ad hoc chaining makes provenance, partial reruns, backend replacement, and experimental feedback difficult to audit. We present RAPID, a run-scoped artifact pipeline for solubility-aware multiple-mutant redesign. RAPID stores typed requests, stage outputs, status and trace records, quality-control summaries, experiment records, and final summaries under stable run identifiers, allowing analyses to be regenerated from artifacts rather than repeated model calls. We evaluate three bounded claims. First, the artifact contract makes model replacement and retrospective analysis operational. Second, a structure-prediction-budgeted surrogate triage mode uses SoluProt gating, ESM-2 embeddings, K-means bootstrap selection, internal cross-validation of local surrogate policies, and Top-K acquisition to reduce AF2/ColabFold evaluations; in a five-target strict run, 49,946 candidates entering triage were reduced to 250 AF2/ColabFold records (99.5% reduction), assuming those candidates would otherwise be folded. Third, target-level variation dominates observed proxy scores, motivating explicit compute-allocation tests across single, BioEmu, RFD3, and RFD3+BioEmu structural contexts. RAPID also provides an experimental-feedback evolution interface for assay-labelled next-candidate recommendation. The present evidence is computational and proxy-based: pLDDT, SoluProt, and relax scores do not establish wet-lab soluble expression, thermodynamic stability, or activity.</w:t>
       </w:r>
     </w:p>
     <w:bookmarkEnd w:id="20"/>
@@ -55,7 +55,7 @@
         <w:pStyle w:val="FirstParagraph"/>
       </w:pPr>
       <w:r>
-        <w:t xml:space="preserve">Computational protein redesign has become a multi-model workflow. A practical solubility-oriented campaign may begin with MMseqs2-based sequence search, derive residue constraints from an MSA, optionally diversify structural context with RFdiffusion or BioEmu, generate multiple-mutant sequences with ProteinMPNN, filter them with a soluble-expression predictor, evaluate selected candidates with AF2 or ColabFold, and finally compare novelty or downstream developability signals [1-8]. The scientific question is often not unconstrained protein generation. It is constrained redesign: starting from an existing target or scaffold, the operator wants a tractable library of multiple-mutant variants that preserves important positions, improves computational soluble-expression likelihood, and remains structurally plausible.</w:t>
+        <w:t xml:space="preserve">Computational protein redesign has become a multi-model workflow. A practical solubility-oriented campaign may begin with MMseqs2-based sequence search, derive residue constraints from an MSA, optionally diversify structural context with RFdiffusion or BioEmu, generate multiple-mutant sequences with ProteinMPNN, filter them with a soluble-expression predictor, evaluate selected candidates with AF2 or ColabFold, and finally compare novelty or downstream developability signals [1-8]. The scientific question is often not unconstrained protein generation. It is constrained redesign: starting from an existing target or scaffold, the operator wants a tractable library of multiple-mutant variants that preserves important positions, improves computational soluble-expression likelihood, and remains structurally plausible. This framing is consistent with earlier work showing that protein expression, stability, and solubility can be improved by structure- and sequence-aware computational design, while still requiring experimental validation for final biological claims [9,10].</w:t>
       </w:r>
     </w:p>
     <w:p>
@@ -79,7 +79,7 @@
         <w:pStyle w:val="BodyText"/>
       </w:pPr>
       <w:r>
-        <w:t xml:space="preserve">We present RAPID, a reproducible artifact pipeline for integrated design. RAPID is not introduced as a new predictive model or as a universal protein-design engine. It is a model-orchestration and artifact layer specialised here for solubility-aware, structural-confidence-guided multiple-mutant redesign. The paper is organised around three claims. First, RAPID converts fragmented model outputs into a reusable, model-replaceable artifact substrate. Second, RAPID implements and benchmarks AF2-budgeted surrogate triage for post-SoluProt candidate selection. Third, RAPID makes structural-context allocation testable by comparing single-backbone, BioEmu, RFD3, and combined RFD3+BioEmu contexts under explicit design and AF2 budgets. Separately, RAPID records wet-lab outcomes and supports experimental-feedback evolution, but experimental activity or expression improvement is not claimed without prospective validation.</w:t>
+        <w:t xml:space="preserve">We present RAPID, a reproducible artifact pipeline for integrated design. RAPID is not introduced as a new predictive model or as a universal protein-design engine. It is a model-orchestration and artifact layer specialised here for solubility-aware, structural-confidence-guided multiple-mutant redesign. The paper is organised around three claims. First, RAPID converts fragmented model outputs into a reusable, model-replaceable artifact substrate. Second, RAPID implements and benchmarks structure-prediction-budgeted surrogate triage for post-SoluProt candidate selection. Third, RAPID makes structural-context allocation testable by comparing single-backbone, BioEmu, RFD3, and combined RFD3+BioEmu contexts under explicit design and AF2 budgets. Separately, RAPID records wet-lab outcomes and supports experimental-feedback evolution, but experimental activity or expression improvement is not claimed without prospective validation.</w:t>
       </w:r>
     </w:p>
     <w:bookmarkEnd w:id="21"/>
@@ -118,7 +118,7 @@
         <w:t xml:space="preserve">msa -&gt; rfd3 -&gt; bioemu -&gt; design -&gt; soluprot -&gt; af2 -&gt; novelty</w:t>
       </w:r>
       <w:r>
-        <w:t xml:space="preserve">. This order is dependency-driven. MSA construction provides conservation-derived residue constraints; optional RFD3 and BioEmu stages provide alternative backbone or conformational contexts; ProteinMPNN generates multiple-mutant sequence libraries under the active fixed-position constraints; SoluProt scores soluble-expression likelihood; AF2 or ColabFold supplies structural-confidence labels; novelty analysis compares surviving designs against sequence databases. Rosetta Relax is available as an optional post-AF2 refinement and scoring step, but it is disabled by default in the benchmark path because full relax coverage was not available for all artifact sets.</w:t>
+        <w:t xml:space="preserve">. This order is dependency-driven. MSA construction provides conservation-derived residue constraints; optional RFD3 and BioEmu stages provide alternative backbone or conformational contexts; ProteinMPNN generates multiple-mutant sequence libraries under the active fixed-position constraints; SoluProt scores soluble-expression likelihood; AF2 or ColabFold supplies structural-confidence labels; novelty analysis compares surviving designs against sequence databases. Rosetta Relax is available as an optional post-AF2 refinement and scoring step, but it is disabled by default in the benchmark path because full relax coverage was not available for all artifact sets [11,14]. The backend is distributed as a pipeline-MCP service, using a tool-oriented service boundary rather than binding the workflow to one browser session or notebook [13].</w:t>
       </w:r>
     </w:p>
     <w:p>
@@ -177,9 +177,9 @@
       <w:r>
         <w:drawing>
           <wp:inline>
-            <wp:extent cx="5334000" cy="2208400"/>
+            <wp:extent cx="5334000" cy="2811703"/>
             <wp:effectExtent b="0" l="0" r="0" t="0"/>
-            <wp:docPr descr="RAPID workflow" title="" id="24" name="Picture"/>
+            <wp:docPr descr="RAPID artifact orchestration" title="" id="24" name="Picture"/>
             <a:graphic>
               <a:graphicData uri="http://schemas.openxmlformats.org/drawingml/2006/picture">
                 <pic:pic>
@@ -198,7 +198,7 @@
                   <pic:spPr bwMode="auto">
                     <a:xfrm>
                       <a:off x="0" y="0"/>
-                      <a:ext cx="5334000" cy="2208400"/>
+                      <a:ext cx="5334000" cy="2811703"/>
                     </a:xfrm>
                     <a:prstGeom prst="rect">
                       <a:avLst/>
@@ -222,7 +222,7 @@
         <w:pStyle w:val="ImageCaption"/>
       </w:pPr>
       <w:r>
-        <w:t xml:space="preserve">RAPID workflow</w:t>
+        <w:t xml:space="preserve">RAPID artifact orchestration</w:t>
       </w:r>
     </w:p>
     <w:p>
@@ -234,7 +234,7 @@
           <w:iCs/>
           <w:i/>
         </w:rPr>
-        <w:t xml:space="preserve">Figure 1. RAPID stage order and diversification levers. The default workflow is solubility-aware multiple-mutant redesign: MSA-derived constraints guide ProteinMPNN sequence generation, SoluProt filters soluble-expression likelihood, and AF2/ColabFold is reserved for structurally plausible short lists. RFD3 and BioEmu provide structural-context diversification, while conservation tiers vary the number and placement of jointly redesigned positions.</w:t>
+        <w:t xml:space="preserve">Figure 1. RAPID provenance-centered redesign substrate. The linear stage order is one operational view. The central contribution is the run_id-centered artifact contract, which preserves requests, stage outputs, status and trace records, quality-control records, metrics, experiment records, and final summaries. This substrate supports safe partial reruns, retrospective benchmark reconstruction, downstream experimental-feedback cycles, and backend replacement without treating RAPID as a simple linear wrapper over model calls.</w:t>
       </w:r>
     </w:p>
     <w:bookmarkEnd w:id="26"/>
@@ -603,17 +603,17 @@
         <w:pStyle w:val="BodyText"/>
       </w:pPr>
       <w:r>
-        <w:t xml:space="preserve">The local browser interface is treated as a reproducibility surface rather than as a separate scientific claim. It exposes the same run identifiers, request fields, status records, and exportable artifacts used by the benchmark scripts, and it is distributed as static assets over the backend API so that RAPID can be run locally or on a GPU server without relying on a hosted service. Interface-level controls and deployment details are reported in the supplement.</w:t>
+        <w:t xml:space="preserve">The local browser interface is treated as a reproducibility surface rather than as a separate scientific claim. It exposes the same run identifiers, request fields, status records, and exportable artifacts used by the benchmark scripts, and it is distributed as static assets over the backend API so that RAPID can be run locally or on a GPU server without relying on a hosted service. Interface-level controls and deployment details are reported in Supplementary Note 14.</w:t>
       </w:r>
     </w:p>
     <w:bookmarkEnd w:id="27"/>
-    <w:bookmarkStart w:id="31" w:name="X60e73cfbaf7ce4bc1cb13fc6e51f68ca82a5cdb"/>
+    <w:bookmarkStart w:id="31" w:name="X9cea73bc856787012fcc690a2b8dd048b7f1dfd"/>
     <w:p>
       <w:pPr>
         <w:pStyle w:val="Heading3"/>
       </w:pPr>
       <w:r>
-        <w:t xml:space="preserve">2.4 AF2-Budgeted Surrogate Triage and Experimental Evolution</w:t>
+        <w:t xml:space="preserve">2.4 Structure-Prediction-Budgeted Surrogate Triage and Experimental Evolution</w:t>
       </w:r>
     </w:p>
     <w:p>
@@ -621,7 +621,7 @@
         <w:pStyle w:val="FirstParagraph"/>
       </w:pPr>
       <w:r>
-        <w:t xml:space="preserve">RAPID separates two related uses of surrogates. The first is a computational AF2-budgeted triage mode used in the benchmark (Figure 2). ProteinMPNN first generates a candidate pool across conservation tiers, and SoluProt scores every candidate. SoluProt-passing candidates are embedded with mean-pooled ESM-2 8M embeddings [4]. In deployment, this embedding stage can be backed by a GPU ESM worker, allowing large ProteinMPNN pools to be featurized without expanding the AF2/ColabFold acquisition budget. K-means selects a diverse bootstrap training set, AF2 labels those candidates, and local surrogate policies are compared by internal cross-validation on the labelled set. The selected acquisition policy is then refit on all bootstrap labels and used to rank the remaining SoluProt-passing pool. AF2 evaluates only the selected policy’s Top-K candidates. This mode is a compute-allocation policy for structure prediction, not evidence of experimental activity or expression.</w:t>
+        <w:t xml:space="preserve">RAPID separates two related uses of surrogates. The first is a computational structure-prediction-budgeted triage mode used in the benchmark (Figure 2). ProteinMPNN first generates a candidate pool across conservation tiers, and SoluProt scores every candidate. SoluProt-passing candidates are embedded with mean-pooled ESM-2 8M embeddings [4]. In deployment, this embedding stage can be backed by a GPU ESM worker, allowing large ProteinMPNN pools to be featurized without expanding the AF2/ColabFold acquisition budget. K-means selects a diverse bootstrap training set, AF2 labels those candidates, and local surrogate policies are compared by internal cross-validation on the labelled set. The selected acquisition policy is then refit on all bootstrap labels and used to rank the remaining SoluProt-passing pool. AF2 evaluates only the selected policy’s Top-K candidates. The supported policy set uses standard Random Forest, Ridge, XGBoost, LightGBM, scikit-learn, k-means, and Bayesian-optimization-inspired acquisition concepts [16-21]. This mode is a compute-allocation policy for structure prediction, not evidence of experimental activity or expression.</w:t>
       </w:r>
     </w:p>
     <w:p>
@@ -679,7 +679,7 @@
         <w:t xml:space="preserve"> </w:t>
       </w:r>
       <w:r>
-        <w:t xml:space="preserve">for the next design-test-learn cycle. A legacy</w:t>
+        <w:t xml:space="preserve">for the next design-test-learn cycle. This interface is related to active-learning directed-evolution frameworks such as EVOLVEpro, but the present manuscript treats it as an assay-feedback handoff rather than as a prospective wet-lab validation result [12]. A legacy</w:t>
       </w:r>
       <w:r>
         <w:t xml:space="preserve"> </w:t>
@@ -702,7 +702,7 @@
         <w:pStyle w:val="BodyText"/>
       </w:pPr>
       <w:r>
-        <w:t xml:space="preserve">This separation is important for biofoundry-scale workflows. The surrogate-triage mode reduces how many candidates require expensive structure prediction before a shortlist is made, whereas experimental-feedback evolution defines how the shortlist can re-enter the system after expression, solubility, activity, or stability assays. Operationally, RAPID provides computational infrastructure upstream of an assay queue: the platform produces traceable shortlists and experiment-request files, while physical measurements are performed outside the software and re-enter RAPID only as labelled outcomes. This is an intended deployment and data pathway, not evidence that the present computational benchmark has already achieved wet-lab enrichment. In other words, RAPID treats computational predictions and experimental measurements as different label sources under the same run-scoped artifact contract. This makes high-throughput candidate generation interpretable across rounds: a later campaign can ask whether a model, masking rule, or backbone context changed the distribution of candidates without manually reconstructing which files, scores, and assay records belonged to each decision.</w:t>
+        <w:t xml:space="preserve">This separation is important for biofoundry-scale workflows. The surrogate-triage mode reduces how many candidates require expensive structure prediction before a shortlist is made, whereas experimental-feedback evolution defines how the shortlist can re-enter the system after expression, solubility, activity, or stability assays. Operationally, RAPID provides computational infrastructure upstream of an assay queue: the platform produces traceable shortlists and experiment-request files, while physical measurements are performed outside the software and re-enter RAPID only as labelled outcomes (see Supplementary Note 10 for an illustrative data-trace schema). This is an intended deployment and data pathway, not evidence that the present computational benchmark has already achieved wet-lab enrichment. In other words, RAPID treats computational predictions and experimental measurements as different label sources under the same run-scoped artifact contract. This makes high-throughput candidate generation interpretable across rounds: a later campaign can ask whether a model, masking rule, or backbone context changed the distribution of candidates without manually reconstructing which files, scores, and assay records belonged to each decision.</w:t>
       </w:r>
     </w:p>
     <w:p>
@@ -712,9 +712,9 @@
       <w:r>
         <w:drawing>
           <wp:inline>
-            <wp:extent cx="5334000" cy="2396434"/>
+            <wp:extent cx="5334000" cy="2435474"/>
             <wp:effectExtent b="0" l="0" r="0" t="0"/>
-            <wp:docPr descr="AF2-budgeted surrogate triage" title="" id="29" name="Picture"/>
+            <wp:docPr descr="structure-prediction-budgeted surrogate triage" title="" id="29" name="Picture"/>
             <a:graphic>
               <a:graphicData uri="http://schemas.openxmlformats.org/drawingml/2006/picture">
                 <pic:pic>
@@ -733,7 +733,7 @@
                   <pic:spPr bwMode="auto">
                     <a:xfrm>
                       <a:off x="0" y="0"/>
-                      <a:ext cx="5334000" cy="2396434"/>
+                      <a:ext cx="5334000" cy="2435474"/>
                     </a:xfrm>
                     <a:prstGeom prst="rect">
                       <a:avLst/>
@@ -757,7 +757,7 @@
         <w:pStyle w:val="ImageCaption"/>
       </w:pPr>
       <w:r>
-        <w:t xml:space="preserve">AF2-budgeted surrogate triage</w:t>
+        <w:t xml:space="preserve">structure-prediction-budgeted surrogate triage</w:t>
       </w:r>
     </w:p>
     <w:p>
@@ -769,7 +769,7 @@
           <w:iCs/>
           <w:i/>
         </w:rPr>
-        <w:t xml:space="preserve">Figure 2. AF2-budgeted surrogate triage. ProteinMPNN candidates from the selected conservation tiers are pooled after SoluProt filtering. K-means selects a diverse AF2-labelled bootstrap set from this pooled candidate set. RAPID compares configured local surrogate policies by internal cross-validation, refits the selected policy on all bootstrap labels, and reserves AF2/ColabFold for one pooled Top-K acquisition set. Comparator-model metrics, optional rank-mean ensemble results, feature summaries, fitted model files, and prediction tables are exported as artifacts without expanding the AF2 budget. Experimental-feedback evolution uses the same candidate and embedding contract but learns from user-recorded wet-lab objective values rather than treating AF2 as a biological oracle.</w:t>
+        <w:t xml:space="preserve">Figure 2. Structure-prediction-budgeted surrogate triage. ProteinMPNN candidates from the selected conservation tiers are pooled after SoluProt filtering. K-means selects a diverse AF2-labelled bootstrap set from this pooled candidate set. RAPID compares configured local surrogate policies by internal cross-validation, refits the selected policy on all bootstrap labels, and reserves AF2/ColabFold for one pooled Top-K acquisition set. Comparator-model metrics, optional rank-mean ensemble results, feature summaries, fitted model files, and prediction tables are exported as artifacts without expanding the AF2 budget. Experimental-feedback evolution uses the same candidate and embedding contract but learns from user-recorded wet-lab objective values rather than treating AF2 as a biological oracle.</w:t>
       </w:r>
     </w:p>
     <w:bookmarkEnd w:id="31"/>
@@ -787,15 +787,15 @@
         <w:pStyle w:val="FirstParagraph"/>
       </w:pPr>
       <w:r>
-        <w:t xml:space="preserve">The current stored artifact benchmark contains 2,737 paired SoluProt and pLDDT records from 23 QC-passing CATH runs. These data were generated before the final corrected-chain CATH refresh and are therefore used in the main text as component-level evidence for AF2-budgeted surrogate triage rather than as the final population estimate for RAPID. Runs with fallback sequences, invalid amino-acid records, missing conservation tiers, or insufficient positive pLDDT records were excluded from that artifact benchmark. The full pre-fix 73-run archive and QC details are reported in the supplement.</w:t>
-      </w:r>
-    </w:p>
-    <w:p>
-      <w:pPr>
-        <w:pStyle w:val="BodyText"/>
-      </w:pPr>
-      <w:r>
-        <w:t xml:space="preserve">The primary surrogate-triage metrics are Spearman rank correlation, Top-K recall, and BO uplift Top-K. BO uplift measures the difference between the mean observed score of the surrogate-selected Top-K and the mean score of K random draws from the same held-out pool. Paired comparisons use Wilcoxon signed-rank tests with Holm correction, and uncertainty is estimated by cluster bootstrap with target as the cluster. Variance decomposition uses a one-way ANOVA intraclass correlation coefficient to estimate how much score variation is attributable to target identity.</w:t>
+        <w:t xml:space="preserve">The current stored artifact benchmark contains 2,737 paired SoluProt and pLDDT records from 23 QC-passing CATH runs [15]. These data were generated before the final corrected-chain CATH refresh and are therefore used in the main text as component-level evidence for structure-prediction-budgeted surrogate triage rather than as the final population estimate for RAPID. Runs with fallback sequences, invalid amino-acid records, missing conservation tiers, or insufficient positive pLDDT records were excluded from that artifact benchmark. The full pre-fix 73-run archive and QC details are reported in Supplementary Notes 1 and 2.</w:t>
+      </w:r>
+    </w:p>
+    <w:p>
+      <w:pPr>
+        <w:pStyle w:val="BodyText"/>
+      </w:pPr>
+      <w:r>
+        <w:t xml:space="preserve">The primary surrogate-triage metrics are Spearman rank correlation, Top-K recall, and BO uplift Top-K. BO uplift measures the difference between the mean observed score of the surrogate-selected Top-K and the mean score of K random draws from the same held-out pool. Paired comparisons use Wilcoxon signed-rank tests with Holm correction, effect-size interpretation uses Cliff’s dominance statistic, and uncertainty is estimated by cluster bootstrap with target as the cluster [22-24]. Variance decomposition uses a one-way ANOVA intraclass correlation coefficient to estimate how much score variation is attributable to target identity [25].</w:t>
       </w:r>
     </w:p>
     <w:bookmarkEnd w:id="32"/>
@@ -1400,13 +1400,13 @@
       </w:r>
     </w:p>
     <w:bookmarkEnd w:id="35"/>
-    <w:bookmarkStart w:id="39" w:name="Xbac834e7075412984afd7ace91d7242c8c20e41"/>
+    <w:bookmarkStart w:id="39" w:name="Xaed6ae3c8569b2806ca477866fa50f61396a90d"/>
     <w:p>
       <w:pPr>
         <w:pStyle w:val="Heading3"/>
       </w:pPr>
       <w:r>
-        <w:t xml:space="preserve">3.2 Claim 2: AF2-Budgeted Surrogate Triage Reduces Structure-Prediction Use After SoluProt Gating</w:t>
+        <w:t xml:space="preserve">3.2 Claim 2: Structure-Prediction-Budgeted Surrogate Triage Reduces Structure-Prediction Use After SoluProt Gating</w:t>
       </w:r>
     </w:p>
     <w:p>
@@ -1414,7 +1414,7 @@
         <w:pStyle w:val="FirstParagraph"/>
       </w:pPr>
       <w:r>
-        <w:t xml:space="preserve">The surrogate-triage benchmark supports a conservative AF2 allocation policy. K-means bootstrap selection is most useful when AF2 labels are scarce: for Random Forest pLDDT BO uplift, K-means improves over random selection by 38% at N = 5, 19% at N = 10, and 12% at N = 20. At N = 30, the difference becomes small because random sampling is already diverse enough in the current pools. This pattern supports K-means as a cold-start safeguard rather than as evidence that it should be preferred at every label budget.</w:t>
+        <w:t xml:space="preserve">The surrogate-triage benchmark supports a conservative structure-prediction allocation policy. K-means bootstrap selection is most useful when AF2 labels are scarce: for Random Forest pLDDT BO uplift, K-means improves over random selection by 38% at N = 5, 19% at N = 10, and 12% at N = 20. At N = 30, the difference becomes small because random sampling is already diverse enough in the current pools. This pattern supports K-means as a cold-start safeguard rather than as evidence that it should be preferred at every label budget.</w:t>
       </w:r>
     </w:p>
     <w:p>
@@ -1654,7 +1654,7 @@
               <w:jc w:val="left"/>
             </w:pPr>
             <w:r>
-              <w:t xml:space="preserve">RF is the conservative AF2-triage reference policy</w:t>
+              <w:t xml:space="preserve">RF is the conservative pLDDT-triage reference policy</w:t>
             </w:r>
           </w:p>
         </w:tc>
@@ -1745,15 +1745,15 @@
           <w:iCs/>
           <w:i/>
         </w:rPr>
-        <w:t xml:space="preserve">Table 4. Surrogate-triage evidence condensed for the main manuscript. The full surrogate, sample-size, and acquisition-bias analyses are moved to supplementary material.</w:t>
-      </w:r>
-    </w:p>
-    <w:p>
-      <w:pPr>
-        <w:pStyle w:val="BodyText"/>
-      </w:pPr>
-      <w:r>
-        <w:t xml:space="preserve">The budget effect is explicit at the run level. The default manuscript configuration generates approximately 9,999 candidates across the three conservation tiers before SoluProt filtering. Folding every SoluProt-passing candidate would require one AF2 call per candidate. The implemented pooled surrogate-triage schedule spends 30 calls on the K-means bootstrap set and 20 calls on surrogate-ranked Top-K candidates, for 50 AF2 calls when the pooled SoluProt-passing set exceeds this budget. The reduction is therefore</w:t>
+        <w:t xml:space="preserve">Table 4. Surrogate-triage evidence condensed for the main manuscript. The full surrogate, sample-size, ensemble, and acquisition-bias analyses are reported in Supplementary Notes 3-7.</w:t>
+      </w:r>
+    </w:p>
+    <w:p>
+      <w:pPr>
+        <w:pStyle w:val="BodyText"/>
+      </w:pPr>
+      <w:r>
+        <w:t xml:space="preserve">The budget effect is explicit at the run level. The default manuscript configuration generates approximately 9,999 ProteinMPNN candidates across the three conservation tiers and applies SoluProt gating before structure-prediction triage. The budget comparison assumes that every candidate entering surrogate triage would otherwise be folded. The implemented pooled surrogate-triage schedule spends 30 calls on the K-means bootstrap set and 20 calls on surrogate-ranked Top-K candidates, for 50 AF2 calls when the pooled triage set exceeds this budget. The reduction is therefore</w:t>
       </w:r>
       <w:r>
         <w:t xml:space="preserve"> </w:t>
@@ -1780,7 +1780,7 @@
         <w:t xml:space="preserve"> </w:t>
       </w:r>
       <w:r>
-        <w:t xml:space="preserve">is the number of SoluProt-passing candidates. Larger pools produce larger absolute savings because the triage budget remains fixed while the full-folding baseline scales with the number of candidates that pass SoluProt.</w:t>
+        <w:t xml:space="preserve">is the number of candidates entering surrogate triage. Larger pools produce larger absolute savings because the triage budget remains fixed while the full-folding baseline scales with the number of candidates that pass upstream filters.</w:t>
       </w:r>
     </w:p>
     <w:tbl>
@@ -1858,7 +1858,7 @@
               <w:jc w:val="left"/>
             </w:pPr>
             <w:r>
-              <w:t xml:space="preserve">One target run, 90 gated candidates</w:t>
+              <w:t xml:space="preserve">One target run, 90 triage candidates</w:t>
             </w:r>
           </w:p>
         </w:tc>
@@ -1908,7 +1908,7 @@
               <w:jc w:val="left"/>
             </w:pPr>
             <w:r>
-              <w:t xml:space="preserve">One target run, 1,000 gated candidates</w:t>
+              <w:t xml:space="preserve">One target run, 1,000 triage candidates</w:t>
             </w:r>
           </w:p>
         </w:tc>
@@ -1958,7 +1958,7 @@
               <w:jc w:val="left"/>
             </w:pPr>
             <w:r>
-              <w:t xml:space="preserve">One target run, 9,999 gated candidates</w:t>
+              <w:t xml:space="preserve">One target run, 9,999 triage candidates</w:t>
             </w:r>
           </w:p>
         </w:tc>
@@ -2009,15 +2009,57 @@
           <w:iCs/>
           <w:i/>
         </w:rPr>
-        <w:t xml:space="preserve">Table 5. AF2 budget model for the standard pooled surrogate-triage mode. The implemented default evaluates 30 K-means bootstrap candidates and 20 Top-K acquisitions selected by one internally cross-validated acquisition policy across the pooled conservation-tier candidate set. Comparator models are trained and exported for audit, but they do not add AF2 calls unless the operator explicitly changes the validation budget. This table is a budget model, not a biological enrichment result; prospective wet-lab outcomes are handled by the separate experimental-feedback evolution mode.</w:t>
-      </w:r>
-    </w:p>
-    <w:p>
-      <w:pPr>
-        <w:pStyle w:val="BodyText"/>
-      </w:pPr>
-      <w:r>
-        <w:t xml:space="preserve">Two representative historical in-silico traces verify that the computational surrogate path is implemented end to end. The 3RGK run evaluated 94 AF2 records from 8,000 SoluProt-gated candidates, and the 1LVM run evaluated 49 AF2 records from 8,000 SoluProt-gated candidates. These traces demonstrate pool generation, SoluProt gating, ESM embedding, K-means bootstrap labelling, surrogate ranking, AF2 acquisition, and final design selection within the stored artifact model. The current operating path uses a GPU-capable ESM embedding provider so that approximately 10,000-candidate pooled multi-tier runs can be ranked while retaining the fixed 30 bootstrap plus 20 Top-K AF2 budget. The traces are not treated as paired biological validation because they cover two targets, use computational pLDDT labels, and have different Top-K settings. The current paper-run script for claim 2 uses the standard surrogate-triage mode rather than experimental-feedback evolution, so the computational budget claim and the wet-lab feedback interface remain separate.</w:t>
+        <w:t xml:space="preserve">Table 5. AF2 budget model for the standard pooled surrogate-triage mode. The implemented default evaluates 30 K-means bootstrap candidates and 20 Top-K acquisitions selected by one internally cross-validated acquisition policy across the pooled conservation-tier candidate set. The</w:t>
+      </w:r>
+      <w:r>
+        <w:rPr>
+          <w:iCs/>
+          <w:i/>
+        </w:rPr>
+        <w:t xml:space="preserve"> </w:t>
+      </w:r>
+      <w:r>
+        <w:rPr>
+          <w:iCs/>
+          <w:i/>
+        </w:rPr>
+        <w:t xml:space="preserve">“</w:t>
+      </w:r>
+      <w:r>
+        <w:rPr>
+          <w:iCs/>
+          <w:i/>
+        </w:rPr>
+        <w:t xml:space="preserve">without surrogate</w:t>
+      </w:r>
+      <w:r>
+        <w:rPr>
+          <w:iCs/>
+          <w:i/>
+        </w:rPr>
+        <w:t xml:space="preserve">”</w:t>
+      </w:r>
+      <w:r>
+        <w:rPr>
+          <w:iCs/>
+          <w:i/>
+        </w:rPr>
+        <w:t xml:space="preserve"> </w:t>
+      </w:r>
+      <w:r>
+        <w:rPr>
+          <w:iCs/>
+          <w:i/>
+        </w:rPr>
+        <w:t xml:space="preserve">column assumes all candidates entering triage would otherwise be folded; it is not a claim that every generated ProteinMPNN candidate is folded. Comparator models are trained and exported for audit, but they do not add AF2 calls unless the operator explicitly changes the validation budget. This table is a budget model, not a biological enrichment result; prospective wet-lab outcomes are handled by the separate experimental-feedback evolution mode.</w:t>
+      </w:r>
+    </w:p>
+    <w:p>
+      <w:pPr>
+        <w:pStyle w:val="BodyText"/>
+      </w:pPr>
+      <w:r>
+        <w:t xml:space="preserve">The current strict paper run verifies this operating point across five CATH targets and 15 conservation-tier outputs. Across 49,946 pooled candidates entering surrogate triage, RAPID evaluated 250 AF2/ColabFold records, corresponding to a 99.5% reduction relative to folding every candidate in the triage pool. The Auto-CV selector chose Random Forest for two targets and Ridge for three targets, while the comparator predictions and fitted-model artifacts were exported for audit without increasing the AF2 budget. All five runs generated 3,333 ProteinMPNN candidates per conservation tier using chunked generation, used the GPU ESM embedding provider, and disabled fallback sequence recovery. Earlier 3RGK and 1LVM traces are retained in Supplementary Note 8 as historical implementation traces rather than as the current operating evidence. The current paper-run script for claim 2 uses the standard surrogate-triage mode rather than experimental-feedback evolution, so the computational budget claim and the wet-lab feedback interface remain separate.</w:t>
       </w:r>
     </w:p>
     <w:bookmarkEnd w:id="39"/>
@@ -2853,7 +2895,15 @@
         <w:pStyle w:val="BodyText"/>
       </w:pPr>
       <w:r>
-        <w:t xml:space="preserve">The surrogate-triage result is similarly bounded. The evidence supports an AF2-allocation policy, not a wet-lab hit-rate claim. K-means is most useful as a cold-start diversity mechanism, Random Forest is a conservative pLDDT acquisition reference, Ridge is useful for SoluProt-oriented ranking, and N = 30 is a cost-efficient bootstrap point in the current artifact benchmark. The current implementation uses those observations to define comparator policies, then selects one acquisition policy by internal CV for each run. The retrospective pooled-CATH analysis further argues against prematurely replacing this per-run calibration with a global pooled model. This is a guardrail result rather than a contradiction of the platform design: under the current feature set and label volume, accumulated computational labels are useful for audit and future modelling, but they do not yet justify a transferable surrogate that supersedes target-local calibration. These findings justify RAPID’s implemented default as a lightweight, run-specific orchestration policy for the expensive AF2 step after SoluProt filtering. The experimental-feedback evolution mode extends the same artifact substrate into a design-test-learn workflow by accepting objective metric values from assay records, but its biological utility must be assessed prospectively.</w:t>
+        <w:t xml:space="preserve">The surrogate-triage result is similarly bounded. The evidence supports a structure-prediction allocation policy, not a wet-lab hit-rate claim. K-means is most useful as a cold-start diversity mechanism, Random Forest is a conservative pLDDT acquisition reference, Ridge is useful for SoluProt-oriented ranking, and N = 30 is a cost-efficient bootstrap point in the current artifact benchmark. The current implementation uses those observations to define comparator policies, then selects one acquisition policy by internal CV for each run. A retrospective guardrail analysis on accumulated CATH artifacts (Supplementary Note 9) shows that simple pooled scaling without target conditioning does not monotonically improve ranking performance, which argues against prematurely replacing per-run calibration with a global pooled model. This is a guardrail result rather than a contradiction of the platform design: under the current feature set and label volume, accumulated computational labels are useful for audit and future modelling, but they do not yet justify a transferable surrogate that supersedes target-local calibration. These findings justify RAPID’s implemented default as a lightweight, run-specific orchestration policy for the expensive AF2 step after SoluProt filtering. The experimental-feedback evolution mode extends the same artifact substrate into a design-test-learn workflow by accepting objective metric values from assay records, but its biological utility must be assessed prospectively.</w:t>
+      </w:r>
+    </w:p>
+    <w:p>
+      <w:pPr>
+        <w:pStyle w:val="BodyText"/>
+      </w:pPr>
+      <w:r>
+        <w:t xml:space="preserve">One plausible reason for the pooled-model guardrail is target heterogeneity. Sequence length, fold class, intrinsic disorder or low-complexity propensity, MSA depth, conservation pattern, and backbone context can all change how sequence edits map to pLDDT or soluble-expression proxies. A pooled model trained before these factors are explicitly conditioned may therefore learn target-level offsets or context-specific noise rather than a transferable acquisition rule. The same logic applies to diversity: the observed acquisition bias (Supplementary Note 6) suggests that future policies should combine predicted quality with explicit ESM-space diversity constraints, such as determinantal point processes, max-min distance filtering, or cluster-balanced Top-K selection, instead of relying on score ranking alone [26].</w:t>
       </w:r>
     </w:p>
     <w:p>
@@ -2913,15 +2963,15 @@
         <w:pStyle w:val="FirstParagraph"/>
       </w:pPr>
       <w:r>
-        <w:t xml:space="preserve">RAPID addresses a practical gap between rapidly changing protein-design models and the reproducible infrastructure needed to use them in solubility-aware redesign campaigns. It preserves run-scoped artifacts, supports controlled partial reruns, exposes the workflow through a packageable static interface and backend API, and keeps model interfaces replaceable. On top of this infrastructure, an AF2-budgeted surrogate-triage mode uses SoluProt gating, K-means bootstrap selection, internal CV-based acquisition-policy selection, and Top-K acquisition to reduce structure-prediction calls while exporting comparator-model evidence for audit. A separate experimental-feedback evolution mode records assay outcomes and uses those labels to recommend the next candidate set.</w:t>
-      </w:r>
-    </w:p>
-    <w:p>
-      <w:pPr>
-        <w:pStyle w:val="BodyText"/>
-      </w:pPr>
-      <w:r>
-        <w:t xml:space="preserve">The manuscript’s central claims are intentionally limited. RAPID makes fragmented model outputs reusable; it reduces AF2/ColabFold evaluations for post-SoluProt triage; and it makes structural-context allocation testable across single, BioEmu, RFD3, and combined contexts. These claims are suitable for a software and empirical benchmark paper because they are tied to stored artifacts, explicit budgets, and reproducible scripts. Experimental solubility, stability, and activity remain future validation targets rather than claims of the present work, even though the software now provides the data path needed to incorporate those measurements in subsequent rounds. The longer-term contribution is therefore a reusable learning substrate for protein redesign: as computational and assay labels accumulate under the same artifact contract, future work can move from per-run surrogates toward target-conditioned preference models without losing provenance.</w:t>
+        <w:t xml:space="preserve">RAPID provides a run-scoped artifact layer for solubility-aware protein redesign. It preserves typed requests, stage outputs, status and trace records, quality-control summaries, experiment records, and final summaries so that heterogeneous model modules can be rerun, replaced, and analysed without rebuilding the workflow around each backend. On top of this infrastructure, the surrogate-triage mode reduces AF2/ColabFold evaluations for post-SoluProt candidate selection while exporting comparator-model evidence for audit.</w:t>
+      </w:r>
+    </w:p>
+    <w:p>
+      <w:pPr>
+        <w:pStyle w:val="BodyText"/>
+      </w:pPr>
+      <w:r>
+        <w:t xml:space="preserve">The manuscript’s claims are intentionally limited. RAPID makes fragmented model outputs reusable, reduces structure-prediction calls under an explicit triage budget, and makes structural-context allocation testable across single, BioEmu, RFD3, and combined contexts. Experimental solubility, stability, and activity remain future validation targets. The longer-term value of RAPID is the reusable learning substrate created as computational labels, assay labels, target metadata, and structural-context decisions accumulate under the same artifact contract.</w:t>
       </w:r>
     </w:p>
     <w:bookmarkEnd w:id="50"/>
@@ -3023,10 +3073,34 @@
         <w:t xml:space="preserve">data/benchmark/results/rapid_target_manifest.csv</w:t>
       </w:r>
       <w:r>
-        <w:t xml:space="preserve"> </w:t>
-      </w:r>
-      <w:r>
-        <w:t xml:space="preserve">in the public-release package. Runtime</w:t>
+        <w:t xml:space="preserve">, and the strict five-target surrogate-triage budget summary is stored as</w:t>
+      </w:r>
+      <w:r>
+        <w:t xml:space="preserve"> </w:t>
+      </w:r>
+      <w:r>
+        <w:rPr>
+          <w:rStyle w:val="VerbatimChar"/>
+        </w:rPr>
+        <w:t xml:space="preserve">data/benchmark/results/surrogate_triage_budget_summary.csv</w:t>
+      </w:r>
+      <w:r>
+        <w:t xml:space="preserve"> </w:t>
+      </w:r>
+      <w:r>
+        <w:t xml:space="preserve">with its TeX table under</w:t>
+      </w:r>
+      <w:r>
+        <w:t xml:space="preserve"> </w:t>
+      </w:r>
+      <w:r>
+        <w:rPr>
+          <w:rStyle w:val="VerbatimChar"/>
+        </w:rPr>
+        <w:t xml:space="preserve">figures/benchmark/table5_surrogate_triage_budget.tex</w:t>
+      </w:r>
+      <w:r>
+        <w:t xml:space="preserve">. Runtime</w:t>
       </w:r>
       <w:r>
         <w:t xml:space="preserve"> </w:t>
@@ -3577,6 +3651,27 @@
       </w:r>
       <w:r>
         <w:t xml:space="preserve">. doi:10.1037/0033-2909.86.2.420</w:t>
+      </w:r>
+    </w:p>
+    <w:p>
+      <w:pPr>
+        <w:pStyle w:val="BodyText"/>
+      </w:pPr>
+      <w:r>
+        <w:t xml:space="preserve">[26] Kulesza, A., &amp; Taskar, B. (2012). Determinantal Point Processes for Machine Learning.</w:t>
+      </w:r>
+      <w:r>
+        <w:t xml:space="preserve"> </w:t>
+      </w:r>
+      <w:r>
+        <w:rPr>
+          <w:iCs/>
+          <w:i/>
+        </w:rPr>
+        <w:t xml:space="preserve">Foundations and Trends in Machine Learning</w:t>
+      </w:r>
+      <w:r>
+        <w:t xml:space="preserve">, 5(2-3), 123-286. doi:10.1561/2200000044</w:t>
       </w:r>
     </w:p>
     <w:bookmarkEnd w:id="52"/>

</xml_diff>

<commit_message>
Update manuscript figures and release artifacts
</commit_message>
<xml_diff>
--- a/docs/manuscript.docx
+++ b/docs/manuscript.docx
@@ -136,14 +136,14 @@
       <w:r>
         <w:drawing>
           <wp:inline>
-            <wp:extent cx="5334000" cy="2811703"/>
+            <wp:extent cx="5334000" cy="3556000"/>
             <wp:effectExtent b="0" l="0" r="0" t="0"/>
             <wp:docPr descr="RAPID artifact orchestration" title="" id="23" name="Picture"/>
             <a:graphic>
               <a:graphicData uri="http://schemas.openxmlformats.org/drawingml/2006/picture">
                 <pic:pic>
                   <pic:nvPicPr>
-                    <pic:cNvPr descr="figures/benchmark/fig1_pipeline_overview.png" id="24" name="Picture"/>
+                    <pic:cNvPr descr="figures/benchmark/figure1.png" id="24" name="Picture"/>
                     <pic:cNvPicPr>
                       <a:picLocks noChangeArrowheads="1" noChangeAspect="1"/>
                     </pic:cNvPicPr>
@@ -157,7 +157,7 @@
                   <pic:spPr bwMode="auto">
                     <a:xfrm>
                       <a:off x="0" y="0"/>
-                      <a:ext cx="5334000" cy="2811703"/>
+                      <a:ext cx="5334000" cy="3556000"/>
                     </a:xfrm>
                     <a:prstGeom prst="rect">
                       <a:avLst/>
@@ -193,7 +193,7 @@
           <w:iCs/>
           <w:i/>
         </w:rPr>
-        <w:t xml:space="preserve">Figure 1. RAPID provenance-centered redesign substrate. The linear stage order is one operational view. The central contribution is the run_id-centered artifact contract, which preserves requests, stage outputs, status and trace records, quality-control records, metrics, experiment records, and final summaries. This substrate supports safe partial reruns, retrospective benchmark reconstruction, downstream experimental-feedback cycles, and backend replacement without treating RAPID as a simple linear wrapper over model calls.</w:t>
+        <w:t xml:space="preserve">Figure 1. RAPID run_id-centered redesign substrate. The linear stage order is only one operational view. The central contribution is the run-scoped artifact contract, which preserves requests, provenance records, stage outputs, surrogate labels, AF2 evaluations, experiment records, and final summaries under stable run identifiers. Structural-context exploration, resource-aware surrogate triage, and experimental-feedback evolution all consume and update the same reusable artifact layer. This architecture supports safe reruns, retrospective analysis, backend replacement, and future preference-dataset accumulation without treating RAPID as a simple linear wrapper over model calls.</w:t>
       </w:r>
     </w:p>
     <w:bookmarkEnd w:id="25"/>
@@ -669,7 +669,7 @@
       <w:r>
         <w:drawing>
           <wp:inline>
-            <wp:extent cx="5334000" cy="3992255"/>
+            <wp:extent cx="5334000" cy="3495087"/>
             <wp:effectExtent b="0" l="0" r="0" t="0"/>
             <wp:docPr descr="Surrogate-triage budget and acquisition summary" title="" id="31" name="Picture"/>
             <a:graphic>
@@ -690,7 +690,7 @@
                   <pic:spPr bwMode="auto">
                     <a:xfrm>
                       <a:off x="0" y="0"/>
-                      <a:ext cx="5334000" cy="3992255"/>
+                      <a:ext cx="5334000" cy="3495087"/>
                     </a:xfrm>
                     <a:prstGeom prst="rect">
                       <a:avLst/>
@@ -726,7 +726,7 @@
           <w:iCs/>
           <w:i/>
         </w:rPr>
-        <w:t xml:space="preserve">Figure 2. Strict five-target surrogate-triage budget and acquisition summary. (A) RAPID evaluates 250 AF2/ColabFold candidate records from 49,946 candidates entering triage, corresponding to a 99.5% reduction relative to folding every triage candidate. (B) Each target uses a fixed 50-record candidate AF2/ColabFold budget after SoluProt filtering and pooled conservation-tier candidate generation. (C) Auto-CV selects the acquisition policy from the 30 bootstrap labels; open circles mark the selected policy for each target. (D) Model-selected Top-K candidates are plotted as pLDDT and SoluProt deltas relative to the WT baseline. Green points improve both computational proxies over WT, grey points are other selected candidates, and the blue diamond marks WT at zero. WT baselines were computed once per target for reference and were not included in the candidate triage-budget count.</w:t>
+        <w:t xml:space="preserve">Figure 2. Strict five-target surrogate-triage budget and acquisition summary. (A) RAPID evaluates 250 AF2/ColabFold candidate records from 49,946 candidates entering triage, corresponding to a 99.5% reduction relative to folding every triage candidate. (B) Each bar is one target and reports the fixed candidate-level AF2/ColabFold validation budget as evaluated records divided by candidates entering triage. (C) Auto-CV selects the acquisition policy from the 30 bootstrap labels; RF and Ridge are offset within each target, marker shape identifies the policy, and an open ring marks the selected policy used for final Top-K acquisition. (D) Each circle is one selected Top-K candidate from one target, plotted after subtracting that target’s WT pLDDT and SoluProt values; WT references are therefore aligned at the blue diamond at zero. Green points improve both computational proxies over WT, whereas grey points are other selected candidates. WT baselines were computed once per target for reference and were not included in the candidate triage-budget count.</w:t>
       </w:r>
     </w:p>
     <w:bookmarkEnd w:id="33"/>

</xml_diff>

<commit_message>
Update Figure 1 artwork in manuscript
</commit_message>
<xml_diff>
--- a/docs/manuscript.docx
+++ b/docs/manuscript.docx
@@ -138,7 +138,7 @@
           <wp:inline>
             <wp:extent cx="5334000" cy="3556000"/>
             <wp:effectExtent b="0" l="0" r="0" t="0"/>
-            <wp:docPr descr="RAPID artifact orchestration" title="" id="23" name="Picture"/>
+            <wp:docPr descr="RAPID run_id-centered redesign substrate" title="" id="23" name="Picture"/>
             <a:graphic>
               <a:graphicData uri="http://schemas.openxmlformats.org/drawingml/2006/picture">
                 <pic:pic>
@@ -181,7 +181,7 @@
         <w:pStyle w:val="ImageCaption"/>
       </w:pPr>
       <w:r>
-        <w:t xml:space="preserve">RAPID artifact orchestration</w:t>
+        <w:t xml:space="preserve">RAPID run_id-centered redesign substrate</w:t>
       </w:r>
     </w:p>
     <w:p>

</xml_diff>

<commit_message>
Clarify structural-context ablation figure
</commit_message>
<xml_diff>
--- a/docs/manuscript.docx
+++ b/docs/manuscript.docx
@@ -37,7 +37,7 @@
         <w:pStyle w:val="FirstParagraph"/>
       </w:pPr>
       <w:r>
-        <w:t xml:space="preserve">Biofoundry-scale protein redesign generates large multiple-mutant libraries, making the practical bottleneck not only model accuracy but auditable allocation of folding and experimental capacity. We present RAPID, a run-scoped artifact pipeline for solubility-aware redesign. RAPID stores typed requests, stage outputs, status traces, quality-control summaries, experiment records, and final summaries under stable run identifiers so reruns and analyses operate on the same artifacts. We evaluate three separate functions. First, RAPID converts fragmented model outputs into traceable artifacts that support partial reruns, backend replacement, and retrospective analysis. Second, RAPID provides a structure-prediction-budgeted surrogate-triage mode for post-SoluProt candidate selection. This mode uses ESM-2 embeddings, K-means bootstrap selection, local surrogate cross-validation, and Top-K acquisition to choose candidates for AF2/ColabFold evaluation; RFD3 and BioEmu are not used. In five CATH targets, surrogate triage evaluated 250 AF2/ColabFold records from 49,946 candidates entering triage, a 99.5% reduction relative to folding every triage candidate. Third, an independent structural-context ablation compares candidate pools generated from the original backbone, RFD3, BioEmu, and RFD3+BioEmu. It tests whether structural inputs broaden the candidate distribution and upper tail, not whether those modules improve the surrogate model. RAPID also supports assay-labelled next-candidate recommendation. All evidence here is computational and proxy-based; pLDDT, SoluProt, and relax scores do not establish wet-lab soluble expression, stability, or activity.</w:t>
+        <w:t xml:space="preserve">Biofoundry-scale protein redesign generates large multiple-mutant libraries, making the practical bottleneck not only model accuracy but auditable allocation of folding and experimental capacity. We present RAPID, a run-scoped artifact pipeline for solubility-aware redesign. RAPID stores typed requests, stage outputs, status traces, quality-control summaries, experiment records, and final summaries under stable run identifiers so reruns and analyses operate on the same artifacts. We evaluate three separate functions. First, RAPID converts fragmented model outputs into traceable artifacts that support partial reruns, backend replacement, and retrospective analysis. Second, RAPID provides a structure-prediction-budgeted surrogate-triage mode for post-SoluProt candidate selection. This mode uses ESM-2 embeddings, K-means bootstrap selection, local surrogate cross-validation, and Top-K acquisition to choose candidates for AF2/ColabFold evaluation; RFD3 and BioEmu are not used. In five CATH targets, surrogate triage evaluated 250 AF2/ColabFold records from 49,946 candidates entering triage, a 99.5% reduction relative to folding every triage candidate. Third, an independent structural-context ablation compares candidate pools generated from the original backbone, RFD3, BioEmu, and RFD3+BioEmu. It tests whether structural inputs reshape candidate-pool spread and sequence diversity, not whether those modules improve the surrogate model. RAPID also supports assay-labelled next-candidate recommendation. All evidence here is computational and proxy-based; pLDDT, SoluProt, and relax scores do not establish wet-lab soluble expression, stability, or activity.</w:t>
       </w:r>
     </w:p>
     <w:bookmarkEnd w:id="20"/>
@@ -744,7 +744,7 @@
         <w:pStyle w:val="FirstParagraph"/>
       </w:pPr>
       <w:r>
-        <w:t xml:space="preserve">The structural-context result is a separate candidate-pool-generation analysis rather than an extension of the five-target surrogate-budget result. The relevant question is not whether an alternative context improves the aggregate mean, but whether it changes the accessible candidate distribution under the same downstream budget. Target identity explained 98.8% of pLDDT variance and 96.8% of SoluProt variance in the stored benchmark, indicating that deeper sampling of one local pool is not the only relevant allocation problem. A single-backbone ProteinMPNN pool can concentrate candidates around one local geometry and mask; any downstream selector can only choose among candidates already generated in that context. In the corrected-chain ablation, RFD3 produced higher maximum pLDDT than the single-backbone arm for four of eight targets, with the largest paired gain of 3.14 pLDDT, despite no aggregate Top-5 mean advantage. BioEmu-containing evaluable arms showed lower mean pairwise identity than the corresponding single-backbone runs and improved the SoluProt upper tail for three of four targets. RFD3 and BioEmu are therefore treated as controlled distribution-broadening modules with explicit QC, not as default score boosters or as surrogate-model components.</w:t>
+        <w:t xml:space="preserve">The structural-context result is a separate candidate-pool-generation analysis rather than an extension of the five-target surrogate-budget result. The relevant question is not whether an alternative context improves the aggregate mean or the best-scoring candidate, but whether it changes the accessible candidate distribution under the same downstream budget. Target identity explained 98.8% of pLDDT variance and 96.8% of SoluProt variance in the stored benchmark, indicating that deeper sampling of one local pool is not the only relevant allocation problem. A single-backbone ProteinMPNN pool can concentrate candidates around one local geometry and mask; any downstream selector can only choose among candidates already generated in that context. In the corrected-chain ablation, alternative contexts did not provide a consistent mean-score or upper-tail advantage. Instead, BioEmu-containing evaluable arms increased pLDDT range and sequence-pool diversity in all four evaluable paired targets, while RFD3 increased pLDDT range in six of eight targets but showed weaker support for SoluProt-spread and diversity shifts. RFD3 and BioEmu are therefore treated as controlled context-perturbation modules with explicit QC, not as default score boosters or as surrogate-model components.</w:t>
       </w:r>
     </w:p>
     <w:p>
@@ -754,7 +754,7 @@
       <w:r>
         <w:drawing>
           <wp:inline>
-            <wp:extent cx="5334000" cy="1686820"/>
+            <wp:extent cx="5334000" cy="4202392"/>
             <wp:effectExtent b="0" l="0" r="0" t="0"/>
             <wp:docPr descr="Structural-context ablation summary" title="" id="35" name="Picture"/>
             <a:graphic>
@@ -775,7 +775,7 @@
                   <pic:spPr bwMode="auto">
                     <a:xfrm>
                       <a:off x="0" y="0"/>
-                      <a:ext cx="5334000" cy="1686820"/>
+                      <a:ext cx="5334000" cy="4202392"/>
                     </a:xfrm>
                     <a:prstGeom prst="rect">
                       <a:avLst/>
@@ -811,7 +811,7 @@
           <w:iCs/>
           <w:i/>
         </w:rPr>
-        <w:t xml:space="preserve">Figure 3. Structural-context ablation as an upper-tail and diversity analysis. Boxplots and points show target-level summaries rather than only arm means. Single-backbone and RFD3 arms were evaluable for all eight selected CATH targets, whereas BioEmu-containing arms were quantitatively evaluable for the four targets that passed the fixed 2.0 Å target-RMSD gate. RFD3 produced target-specific high-pLDDT upper-tail candidates without improving the aggregate Top-5 mean, while BioEmu-containing evaluable arms reduced pairwise identity and broadened SoluProt upper-tail signals. Detailed structural-context and BioEmu QC tables are reported in the supplement.</w:t>
+        <w:t xml:space="preserve">Figure 3. Structural-context ablation as context-dependent candidate-pool shifts. Panels A-C show absolute target-level distributions for pLDDT range, SoluProt range, and mean pairwise diversity across the single-backbone, BioEmu, RFD3, and RFD3+BioEmu arms. Points are targets and boxes summarize target distributions; the label above each arm reports the number of evaluable targets. Panel D reports paired directional support relative to the single-backbone arm, with bar labels showing positive paired targets over evaluable paired targets. Single-backbone and RFD3 arms were evaluable for all eight selected CATH targets, whereas BioEmu-containing arms were quantitatively evaluable for the four targets that passed the fixed 2.0 Å target-RMSD gate. The result supports structural-context sensitivity and diversity shifts rather than a universal upper-tail score improvement. Detailed structural-context and BioEmu QC tables are reported in the supplement.</w:t>
       </w:r>
     </w:p>
     <w:bookmarkEnd w:id="37"/>
@@ -870,7 +870,7 @@
         <w:pStyle w:val="BodyText"/>
       </w:pPr>
       <w:r>
-        <w:t xml:space="preserve">The structural-context result reframes backbone and ensemble stages as distribution-broadening levers. If observed variance were mainly within a target, deeper ProteinMPNN sampling would be the primary way to spend compute. Instead, target identity dominates the stored benchmark, and the corrected-chain structural-context ablation shows target-dependent tradeoffs under matched AF2 caps. A single-backbone ProteinMPNN pool can overrepresent sequences compatible with one local geometry and mask; downstream triage can rank that local neighbourhood efficiently but cannot recover candidates that were never generated. The useful signal is therefore in the spread and upper tail as much as in the mean: RFD3 occasionally created higher-confidence tail candidates, while BioEmu more consistently broadened sequence diversity among evaluable targets. This pattern argues for treating RFD3 and BioEmu as controlled exploration modules with explicit QC, rather than as default score-improvement modules.</w:t>
+        <w:t xml:space="preserve">The structural-context result reframes backbone and ensemble stages as context-sensitivity probes. If observed variance were mainly within a target, deeper ProteinMPNN sampling would be the primary way to spend compute. Instead, target identity dominates the stored benchmark, and the corrected-chain structural-context ablation shows target-dependent tradeoffs under matched AF2 caps. A single-backbone ProteinMPNN pool can overrepresent sequences compatible with one local geometry and mask; downstream triage can rank that local neighbourhood efficiently but cannot recover candidates that were never generated. The useful signal is therefore the paired change in score spread and sequence diversity, not an aggregate claim that one structural-context module improves quality. RFD3 primarily shifted pLDDT spread in a subset of targets, whereas BioEmu-containing evaluable arms more consistently increased sequence-pool diversity. This pattern argues for treating RFD3 and BioEmu as controlled exploration modules with explicit QC, rather than as default score-improvement modules.</w:t>
       </w:r>
     </w:p>
     <w:p>

</xml_diff>

<commit_message>
Refine structural-context figure legend
</commit_message>
<xml_diff>
--- a/docs/manuscript.docx
+++ b/docs/manuscript.docx
@@ -754,7 +754,7 @@
       <w:r>
         <w:drawing>
           <wp:inline>
-            <wp:extent cx="5334000" cy="4202392"/>
+            <wp:extent cx="5334000" cy="3905796"/>
             <wp:effectExtent b="0" l="0" r="0" t="0"/>
             <wp:docPr descr="Structural-context ablation summary" title="" id="35" name="Picture"/>
             <a:graphic>
@@ -775,7 +775,7 @@
                   <pic:spPr bwMode="auto">
                     <a:xfrm>
                       <a:off x="0" y="0"/>
-                      <a:ext cx="5334000" cy="4202392"/>
+                      <a:ext cx="5334000" cy="3905796"/>
                     </a:xfrm>
                     <a:prstGeom prst="rect">
                       <a:avLst/>
@@ -811,7 +811,7 @@
           <w:iCs/>
           <w:i/>
         </w:rPr>
-        <w:t xml:space="preserve">Figure 3. Structural-context ablation as context-dependent candidate-pool shifts. Panels A-C show absolute target-level distributions for pLDDT range, SoluProt range, and mean pairwise diversity across the single-backbone, BioEmu, RFD3, and RFD3+BioEmu arms. Points are targets and boxes summarize target distributions; the label above each arm reports the number of evaluable targets. Panel D reports paired directional support relative to the single-backbone arm, with bar labels showing positive paired targets over evaluable paired targets. Single-backbone and RFD3 arms were evaluable for all eight selected CATH targets, whereas BioEmu-containing arms were quantitatively evaluable for the four targets that passed the fixed 2.0 Å target-RMSD gate. The result supports structural-context sensitivity and diversity shifts rather than a universal upper-tail score improvement. Detailed structural-context and BioEmu QC tables are reported in the supplement.</w:t>
+        <w:t xml:space="preserve">Figure 3. Structural-context ablation as context-dependent candidate-pool shifts. Panels A-C show absolute target-level distributions for pLDDT range, SoluProt range, and mean pairwise diversity across the single-backbone, BioEmu, RFD3, and RFD3+BioEmu arms. Points are targets and boxes summarize target distributions; the label above each arm reports the number of evaluable targets. Higher mean pairwise diversity indicates lower sequence similarity within the candidate pool. Panel D reports positive paired shifts relative to the single-backbone arm, with bar labels showing positive paired targets over evaluable paired targets. Single-backbone and RFD3 arms were evaluable for all eight selected CATH targets, whereas BioEmu-containing arms were quantitatively evaluable for the four targets that passed the fixed 2.0 Å target-RMSD gate. The result supports structural-context sensitivity and diversity shifts rather than a universal upper-tail score improvement. Detailed structural-context and BioEmu QC tables are reported in the supplement.</w:t>
       </w:r>
     </w:p>
     <w:bookmarkEnd w:id="37"/>

</xml_diff>

<commit_message>
Integrate surrogate triage into RAPID pipeline
</commit_message>
<xml_diff>
--- a/docs/manuscript.docx
+++ b/docs/manuscript.docx
@@ -37,7 +37,7 @@
         <w:pStyle w:val="FirstParagraph"/>
       </w:pPr>
       <w:r>
-        <w:t xml:space="preserve">Biofoundry-scale protein redesign generates large multiple-mutant libraries, making the practical bottleneck not only model accuracy but auditable allocation of folding and experimental capacity. We present RAPID, a run-scoped artifact pipeline for solubility-aware redesign. RAPID stores typed requests, stage outputs, status traces, quality-control summaries, experiment records, and final summaries under stable run identifiers so reruns and analyses operate on the same artifacts. We evaluate three separate functions. First, RAPID converts fragmented model outputs into traceable artifacts that support partial reruns, backend replacement, and retrospective analysis. Second, RAPID provides a structure-prediction-budgeted surrogate-triage mode for post-SoluProt candidate selection. This mode uses ESM-2 embeddings, K-means bootstrap selection, local surrogate cross-validation, and Top-K acquisition to choose candidates for AF2/ColabFold evaluation; RFD3 and BioEmu are not used. In five CATH targets, surrogate triage evaluated 250 AF2/ColabFold records from 49,946 candidates entering triage, a 99.5% reduction relative to folding every triage candidate. Third, an independent structural-context ablation compares candidate pools generated from the original backbone, RFD3, BioEmu, and RFD3+BioEmu. It tests whether structural inputs reshape candidate-pool spread and sequence diversity, not whether those modules improve the surrogate model. RAPID also supports assay-labelled next-candidate recommendation. All evidence here is computational and proxy-based; pLDDT, SoluProt, and relax scores do not establish wet-lab soluble expression, stability, or activity.</w:t>
+        <w:t xml:space="preserve">Biofoundry-scale protein redesign generates large multiple-mutant libraries, making the practical bottleneck not only model accuracy but auditable allocation of folding and experimental capacity. We present RAPID, a run-scoped artifact pipeline for solubility-aware redesign. RAPID stores typed requests, stage outputs, status traces, quality-control summaries, experiment records, and final summaries under stable run identifiers so reruns and analyses operate on the same artifacts. We evaluate three separate functions. First, RAPID converts fragmented model outputs into traceable artifacts that support partial reruns, backend replacement, and retrospective analysis. Second, RAPID provides a post-SoluProt, structure-prediction-budgeted surrogate-triage layer that can be enabled within the redesign pipeline. In the isolated budget benchmark, this layer was run on original-backbone candidate pools to avoid conflating triage efficiency with structural-context expansion. Using ESM-2 embeddings, K-means bootstrap selection, local surrogate cross-validation, and Top-K acquisition, RAPID evaluated 250 AF2/ColabFold records from 49,946 candidates entering triage across five CATH targets, a 99.5% reduction relative to folding every triage candidate. Third, an independent structural-context ablation compares candidate pools generated from the original backbone, RFD3, BioEmu, and RFD3+BioEmu. It tests whether structural inputs reshape candidate-pool spread and sequence diversity, not whether those modules improve the surrogate model. RAPID also supports assay-labelled next-candidate recommendation. All evidence here is computational and proxy-based; pLDDT, SoluProt, and relax scores do not establish wet-lab soluble expression, stability, or activity.</w:t>
       </w:r>
     </w:p>
     <w:bookmarkEnd w:id="20"/>
@@ -79,7 +79,7 @@
         <w:pStyle w:val="BodyText"/>
       </w:pPr>
       <w:r>
-        <w:t xml:space="preserve">We present RAPID, a reproducible artifact pipeline for integrated design. RAPID is not introduced as a new predictive model or as a universal protein-design engine. It is a model-orchestration and artifact layer specialised here for solubility-aware, structural-confidence-guided multiple-mutant redesign. The paper is organised around three claims. First, RAPID converts fragmented model outputs into a reusable, model-replaceable artifact substrate. Second, RAPID implements and benchmarks structure-prediction-budgeted surrogate triage for post-SoluProt candidate selection using the original target backbone only. Third, in a separate structural-context ablation, RAPID compares candidate pools generated from the original backbone, BioEmu, RFD3, and combined RFD3+BioEmu contexts under explicit design and AF2 budgets. The structural-context ablation changes upstream candidate generation and is not part of the surrogate-triage budget experiment. Separately, RAPID records wet-lab outcomes and supports experimental-feedback evolution, but experimental activity or expression improvement is not claimed without prospective validation.</w:t>
+        <w:t xml:space="preserve">We present RAPID, a reproducible artifact pipeline for integrated design. RAPID is not introduced as a new predictive model or as a universal protein-design engine. It is a model-orchestration and artifact layer specialised here for solubility-aware, structural-confidence-guided multiple-mutant redesign. The paper is organised around three claims. First, RAPID converts fragmented model outputs into a reusable, model-replaceable artifact substrate. Second, RAPID implements and benchmarks structure-prediction-budgeted surrogate triage for post-SoluProt candidate selection in an isolated original-backbone benchmark. Third, in a separate structural-context ablation, RAPID compares candidate pools generated from the original backbone, BioEmu, RFD3, and combined RFD3+BioEmu contexts under explicit design and AF2 budgets. Operationally, the same surrogate-triage layer can be enabled after optional structural-context stages, but the reported budget-reduction benchmark keeps those axes separate. Separately, RAPID records wet-lab outcomes and supports experimental-feedback evolution, but experimental activity or expression improvement is not claimed without prospective validation.</w:t>
       </w:r>
     </w:p>
     <w:bookmarkEnd w:id="21"/>
@@ -211,15 +211,15 @@
         <w:pStyle w:val="FirstParagraph"/>
       </w:pPr>
       <w:r>
-        <w:t xml:space="preserve">RAPID separates two related uses of surrogates. The first is a computational structure-prediction-budgeted triage mode used in the benchmark. ProteinMPNN first generates a candidate pool across conservation tiers, and SoluProt scores every candidate. SoluProt-passing candidates are embedded with mean-pooled ESM-2 8M embeddings [4]. In deployment, this embedding stage can be backed by a GPU ESM worker, allowing large ProteinMPNN pools to be featurized without expanding the AF2/ColabFold acquisition budget. K-means selects a diverse bootstrap training set, AF2 labels those candidates, and local surrogate policies are compared by internal cross-validation on the labelled set. The selected acquisition policy is then refit on all bootstrap labels and used to rank the remaining SoluProt-passing pool. AF2 evaluates only the selected policy’s Top-K candidates. The supported policy set uses standard Random Forest, Ridge, XGBoost, LightGBM, scikit-learn, k-means, and Bayesian-optimization-inspired acquisition concepts [16-21]. This mode is a compute-allocation policy for structure prediction, not evidence of experimental activity or expression.</w:t>
-      </w:r>
-    </w:p>
-    <w:p>
-      <w:pPr>
-        <w:pStyle w:val="BodyText"/>
-      </w:pPr>
-      <w:r>
-        <w:t xml:space="preserve">The production triage default uses one shared budget across the selected 30%, 50%, and 70% conservation tiers. In the manuscript benchmark, this mode uses the original target backbone and disables RFD3 and BioEmu so that the AF2-budget reduction is attributed to surrogate triage rather than to structural-context expansion. No RFD3 or BioEmu outputs enter the candidate pool for this surrogate-triage budget result. By default, ProteinMPNN requests 3,333 candidates per tier, giving a nominal 9,999 designs before validation and SoluProt filtering. RAPID then labels 30 K-means-selected bootstrap candidates from the pooled SoluProt-passing set and evaluates 20 Top-K AF2 acquisitions from the same pooled set. The N = 30 bootstrap was chosen because the sample-size ablation reaches most of the observed Random Forest pLDDT uplift by that point, while Top-K = 20 fixes a target-level validation budget that is large enough for manual review but small enough to keep the AF2 cost explicit. RAPID trains comparator policies on the same labelled bootstrap set, writes cross-validation metrics, a model-comparison SVG, candidate-level predictions, feature-importance or coefficient tables, and fitted model files, and then uses only one selected acquisition policy for the final Top-K. Thus model comparison is recorded without multiplying AF2 calls. Manual override remains available for controlled runs using Random Forest, Ridge, XGBoost, LightGBM, or rank-mean ensemble.</w:t>
+        <w:t xml:space="preserve">RAPID separates two related uses of surrogates. The first is a computational structure-prediction-budgeted triage layer used in the benchmark. ProteinMPNN first generates a candidate pool across conservation tiers, and SoluProt scores every candidate. SoluProt-passing candidates are embedded with mean-pooled ESM-2 8M embeddings [4]. In deployment, this embedding stage can be backed by a GPU ESM worker, allowing large ProteinMPNN pools to be featurized without expanding the AF2/ColabFold acquisition budget. K-means selects a diverse bootstrap training set, AF2 labels those candidates, and local surrogate policies are compared by internal cross-validation on the labelled set. The selected acquisition policy is then refit on all bootstrap labels and used to rank the remaining SoluProt-passing pool. AF2 evaluates only the selected policy’s Top-K candidates. The supported policy set uses standard Random Forest, Ridge, XGBoost, LightGBM, scikit-learn, k-means, and Bayesian-optimization-inspired acquisition concepts [16-21]. In the software, this triage layer is a switchable component after SoluProt and can be combined with optional upstream RFD3 or BioEmu stages. In the benchmark, it is evaluated on original-backbone candidate pools to isolate compute allocation from structural-context exploration. This mode is a compute-allocation policy for structure prediction, not evidence of experimental activity or expression.</w:t>
+      </w:r>
+    </w:p>
+    <w:p>
+      <w:pPr>
+        <w:pStyle w:val="BodyText"/>
+      </w:pPr>
+      <w:r>
+        <w:t xml:space="preserve">The production triage default uses one shared budget across the selected 30%, 50%, and 70% conservation tiers. In the manuscript benchmark, this layer is evaluated with the original target backbone and without RFD3 or BioEmu-generated candidate pools so that the AF2-budget reduction is attributed to surrogate triage rather than to structural-context expansion. By default, ProteinMPNN requests 3,333 candidates per tier, giving a nominal 9,999 designs before validation and SoluProt filtering. RAPID then labels 30 K-means-selected bootstrap candidates from the pooled SoluProt-passing set and evaluates 20 Top-K AF2 acquisitions from the same pooled set. The N = 30 bootstrap was chosen because the sample-size ablation reaches most of the observed Random Forest pLDDT uplift by that point, while Top-K = 20 fixes a target-level validation budget that is large enough for manual review but small enough to keep the AF2 cost explicit. RAPID trains comparator policies on the same labelled bootstrap set, writes cross-validation metrics, a model-comparison SVG, candidate-level predictions, feature-importance or coefficient tables, and fitted model files, and then uses only one selected acquisition policy for the final Top-K. Thus model comparison is recorded without multiplying AF2 calls. Manual override remains available for controlled runs using Random Forest, Ridge, XGBoost, LightGBM, or rank-mean ensemble.</w:t>
       </w:r>
     </w:p>
     <w:p>

</xml_diff>

<commit_message>
Simplify Figure 1 and rewrite caption for the three-claim workflow
Replace figure1.png with a 3-tier layout (design request -> run-scoped
record -> three numbered subsystems) that is readable at journal column
width. The new figure makes the three paper claims and the per-target
budget callout (~10,000 designs -> 30 bootstrap labels -> 20 AF2 calls)
visible directly. It also surfaces the "Analyzed separately from the
surrogate-triage budget benchmark" disclaimer used in section 3.3, and
the "modular backends can be replaced" message that was previously
spread across multiple sub-panels.

Caption rewritten to match the new visual structure while keeping the
artifact-contract framing. manuscript.docx files re-rendered with
pandoc. Old figure removed (history retains the previous version).

Co-Authored-By: Claude Opus 4.7 (1M context) <noreply@anthropic.com>
</commit_message>
<xml_diff>
--- a/docs/manuscript.docx
+++ b/docs/manuscript.docx
@@ -136,9 +136,9 @@
       <w:r>
         <w:drawing>
           <wp:inline>
-            <wp:extent cx="5334000" cy="3556000"/>
+            <wp:extent cx="5334000" cy="4000499"/>
             <wp:effectExtent b="0" l="0" r="0" t="0"/>
-            <wp:docPr descr="RAPID run_id-centered redesign substrate" title="" id="23" name="Picture"/>
+            <wp:docPr descr="RAPID run-scoped redesign workflow" title="" id="23" name="Picture"/>
             <a:graphic>
               <a:graphicData uri="http://schemas.openxmlformats.org/drawingml/2006/picture">
                 <pic:pic>
@@ -157,7 +157,7 @@
                   <pic:spPr bwMode="auto">
                     <a:xfrm>
                       <a:off x="0" y="0"/>
-                      <a:ext cx="5334000" cy="3556000"/>
+                      <a:ext cx="5334000" cy="4000499"/>
                     </a:xfrm>
                     <a:prstGeom prst="rect">
                       <a:avLst/>
@@ -181,19 +181,19 @@
         <w:pStyle w:val="ImageCaption"/>
       </w:pPr>
       <w:r>
-        <w:t xml:space="preserve">RAPID run_id-centered redesign substrate</w:t>
-      </w:r>
-    </w:p>
-    <w:p>
-      <w:pPr>
-        <w:pStyle w:val="BodyText"/>
-      </w:pPr>
-      <w:r>
-        <w:rPr>
-          <w:iCs/>
-          <w:i/>
-        </w:rPr>
-        <w:t xml:space="preserve">Figure 1. RAPID run_id-centered redesign substrate. The linear stage order is only one operational view. The central contribution is the run-scoped artifact contract, which preserves requests, provenance records, stage outputs, surrogate labels, AF2 evaluations, experiment records, and final summaries under stable run identifiers. Structural-context exploration, resource-aware surrogate triage, and experimental-feedback evolution all consume and update the same reusable artifact layer. This architecture supports safe reruns, retrospective analysis, backend replacement, and future preference-dataset accumulation without treating RAPID as a simple linear wrapper over model calls.</w:t>
+        <w:t xml:space="preserve">RAPID run-scoped redesign workflow</w:t>
+      </w:r>
+    </w:p>
+    <w:p>
+      <w:pPr>
+        <w:pStyle w:val="BodyText"/>
+      </w:pPr>
+      <w:r>
+        <w:rPr>
+          <w:iCs/>
+          <w:i/>
+        </w:rPr>
+        <w:t xml:space="preserve">Figure 1. RAPID run-scoped redesign workflow. A typed design request — target, mask and position constraints, resource budget, and mode — is written into the shared run-scoped record, which stores requests, stage outputs, QC summaries, AF2 labels, and assay records under a stable run identifier. The three subsystems consume and update this same record: (1) structural-context exploration generates candidate pools from the original backbone, RFD3, BioEmu, or RFD3+BioEmu via MSA-informed ProteinMPNN design and SoluProt filtering; (2) resource-aware surrogate triage labels a K-means bootstrap with AF2/ColabFold, selects an acquisition policy by cross-validation, and spends the Top-K AF2 budget (per target in the main benchmark: ≈10,000 designs → 30 bootstrap labels → 20 AF2 evaluations); and (3) experimental-feedback evolution loops assay results back into next-candidate recommendation. Structural-context exploration is analysed separately from the surrogate-triage budget benchmark to keep compute allocation distinct from candidate-pool generation. Modular backends can be replaced if they read from and write to the same run record, which is the basis for partial reruns, retrospective benchmark reconstruction, and future preference-dataset accumulation.</w:t>
       </w:r>
     </w:p>
     <w:bookmarkEnd w:id="25"/>

</xml_diff>